<commit_message>
Update to the 2026-10-25 BMC Genomics submission version
- Replace Manuscript.docx with the submitted version and add Cover_Letter.docx
- Replace main Figures 1-5 with the submitted 170 mm TIFFs and PNG/PDF exports
- Add Additional_file_1 (Supplementary Figures S1-S6) and Additional_file_2 (Tables ST01-ST09)
- Replace the main table DOCX files and the ST01-ST09 workbook
- Update README, MANIFEST, CITATION, availability statements and both file manifests
- Remove the retired Supplementary Figure S7, the main-figure SVG copies and the old S1-S7 preview package
</commit_message>
<xml_diff>
--- a/results/tables/manuscript/main/Table_2_prioritization.docx
+++ b/results/tables/manuscript/main/Table_2_prioritization.docx
@@ -4,18 +4,32 @@
   <w:body>
     <w:p>
       <w:pPr>
-        <w:pStyle w:val="3"/>
+        <w:spacing w:before="0" w:after="120" w:line="276" w:lineRule="auto"/>
       </w:pPr>
       <w:r>
-        <w:t>Table 2. Integrated prioritization of candidate transcription factors</w:t>
+        <w:rPr>
+          <w:rFonts w:ascii="Times New Roman" w:hAnsi="Times New Roman" w:eastAsia="Times New Roman"/>
+          <w:b/>
+          <w:i w:val="0"/>
+          <w:sz w:val="22"/>
+        </w:rPr>
+        <w:t>Table 2. Axis direction and cross-analysis robustness of the prioritised candidate transcription factors.</w:t>
       </w:r>
     </w:p>
     <w:tbl>
       <w:tblPr>
-        <w:tblStyle w:val="32"/>
-        <w:tblW w:w="5000" w:type="pct"/>
+        <w:tblStyle w:val="33"/>
+        <w:tblW w:w="0" w:type="auto"/>
         <w:jc w:val="center"/>
-        <w:tblLayout w:type="autofit"/>
+        <w:tblBorders>
+          <w:top w:val="single" w:color="auto" w:sz="4" w:space="0"/>
+          <w:left w:val="single" w:color="auto" w:sz="4" w:space="0"/>
+          <w:bottom w:val="single" w:color="auto" w:sz="4" w:space="0"/>
+          <w:right w:val="single" w:color="auto" w:sz="4" w:space="0"/>
+          <w:insideH w:val="single" w:color="auto" w:sz="4" w:space="0"/>
+          <w:insideV w:val="single" w:color="auto" w:sz="4" w:space="0"/>
+        </w:tblBorders>
+        <w:tblLayout w:type="fixed"/>
         <w:tblCellMar>
           <w:top w:w="0" w:type="dxa"/>
           <w:left w:w="108" w:type="dxa"/>
@@ -24,16 +38,26 @@
         </w:tblCellMar>
       </w:tblPr>
       <w:tblGrid>
-        <w:gridCol w:w="873"/>
-        <w:gridCol w:w="915"/>
-        <w:gridCol w:w="945"/>
-        <w:gridCol w:w="1154"/>
-        <w:gridCol w:w="1909"/>
-        <w:gridCol w:w="1971"/>
-        <w:gridCol w:w="1089"/>
+        <w:gridCol w:w="1571"/>
+        <w:gridCol w:w="1571"/>
+        <w:gridCol w:w="1571"/>
+        <w:gridCol w:w="1571"/>
+        <w:gridCol w:w="1571"/>
+        <w:gridCol w:w="1571"/>
+        <w:gridCol w:w="1571"/>
+        <w:gridCol w:w="1571"/>
+        <w:gridCol w:w="1571"/>
       </w:tblGrid>
       <w:tr>
         <w:tblPrEx>
+          <w:tblBorders>
+            <w:top w:val="single" w:color="auto" w:sz="4" w:space="0"/>
+            <w:left w:val="single" w:color="auto" w:sz="4" w:space="0"/>
+            <w:bottom w:val="single" w:color="auto" w:sz="4" w:space="0"/>
+            <w:right w:val="single" w:color="auto" w:sz="4" w:space="0"/>
+            <w:insideH w:val="single" w:color="auto" w:sz="4" w:space="0"/>
+            <w:insideV w:val="single" w:color="auto" w:sz="4" w:space="0"/>
+          </w:tblBorders>
           <w:tblCellMar>
             <w:top w:w="0" w:type="dxa"/>
             <w:left w:w="108" w:type="dxa"/>
@@ -42,79 +66,60 @@
           </w:tblCellMar>
         </w:tblPrEx>
         <w:trPr>
-          <w:trHeight w:val="0" w:hRule="atLeast"/>
-          <w:tblHeader/>
           <w:jc w:val="center"/>
         </w:trPr>
         <w:tc>
           <w:tcPr>
-            <w:tcW w:w="502" w:type="pct"/>
-            <w:tcBorders>
-              <w:top w:val="single" w:color="auto" w:sz="12" w:space="0"/>
-              <w:left w:val="nil"/>
-              <w:bottom w:val="nil"/>
-              <w:right w:val="nil"/>
-            </w:tcBorders>
-            <w:noWrap w:val="0"/>
-            <w:tcMar>
-              <w:top w:w="-1" w:type="dxa"/>
-              <w:left w:w="-1" w:type="dxa"/>
-              <w:bottom w:w="-1" w:type="dxa"/>
-              <w:right w:w="-1" w:type="dxa"/>
-            </w:tcMar>
-            <w:vAlign w:val="center"/>
+            <w:tcW w:w="1587" w:type="dxa"/>
           </w:tcPr>
           <w:p>
             <w:pPr>
-              <w:snapToGrid w:val="0"/>
-              <w:spacing w:line="240" w:lineRule="auto"/>
-              <w:ind w:left="0" w:leftChars="0" w:right="0" w:rightChars="0" w:firstLine="0" w:firstLineChars="0"/>
-              <w:jc w:val="center"/>
-              <w:rPr>
-                <w:b/>
-              </w:rPr>
+              <w:spacing w:after="0" w:line="240" w:lineRule="auto"/>
             </w:pPr>
-            <w:bookmarkStart w:id="0" w:name="_GoBack"/>
-            <w:bookmarkEnd w:id="0"/>
             <w:r>
               <w:rPr>
+                <w:rFonts w:ascii="Times New Roman" w:hAnsi="Times New Roman" w:eastAsia="Times New Roman"/>
                 <w:b/>
+                <w:i w:val="0"/>
+                <w:sz w:val="18"/>
               </w:rPr>
-              <w:t>TF</w:t>
+              <w:t>Transcription factor</w:t>
             </w:r>
           </w:p>
         </w:tc>
         <w:tc>
           <w:tcPr>
-            <w:tcW w:w="526" w:type="pct"/>
-            <w:tcBorders>
-              <w:top w:val="single" w:color="auto" w:sz="12" w:space="0"/>
-              <w:left w:val="nil"/>
-              <w:bottom w:val="nil"/>
-              <w:right w:val="nil"/>
-            </w:tcBorders>
-            <w:noWrap w:val="0"/>
-            <w:tcMar>
-              <w:top w:w="-1" w:type="dxa"/>
-              <w:left w:w="-1" w:type="dxa"/>
-              <w:bottom w:w="-1" w:type="dxa"/>
-              <w:right w:w="-1" w:type="dxa"/>
-            </w:tcMar>
-            <w:vAlign w:val="center"/>
+            <w:tcW w:w="1361" w:type="dxa"/>
           </w:tcPr>
           <w:p>
             <w:pPr>
-              <w:snapToGrid w:val="0"/>
-              <w:spacing w:line="240" w:lineRule="auto"/>
-              <w:ind w:left="0" w:leftChars="0" w:right="0" w:rightChars="0" w:firstLine="0" w:firstLineChars="0"/>
-              <w:jc w:val="center"/>
-              <w:rPr>
-                <w:b/>
-              </w:rPr>
+              <w:spacing w:after="0" w:line="240" w:lineRule="auto"/>
             </w:pPr>
             <w:r>
               <w:rPr>
+                <w:rFonts w:ascii="Times New Roman" w:hAnsi="Times New Roman" w:eastAsia="Times New Roman"/>
                 <w:b/>
+                <w:i w:val="0"/>
+                <w:sz w:val="18"/>
+              </w:rPr>
+              <w:t>Literature evidence class</w:t>
+            </w:r>
+          </w:p>
+        </w:tc>
+        <w:tc>
+          <w:tcPr>
+            <w:tcW w:w="1928" w:type="dxa"/>
+          </w:tcPr>
+          <w:p>
+            <w:pPr>
+              <w:spacing w:after="0" w:line="240" w:lineRule="auto"/>
+            </w:pPr>
+            <w:r>
+              <w:rPr>
+                <w:rFonts w:ascii="Times New Roman" w:hAnsi="Times New Roman" w:eastAsia="Times New Roman"/>
+                <w:b/>
+                <w:i w:val="0"/>
+                <w:sz w:val="18"/>
               </w:rPr>
               <w:t>Axis direction</w:t>
             </w:r>
@@ -122,187 +127,129 @@
         </w:tc>
         <w:tc>
           <w:tcPr>
-            <w:tcW w:w="543" w:type="pct"/>
-            <w:tcBorders>
-              <w:top w:val="single" w:color="auto" w:sz="12" w:space="0"/>
-              <w:left w:val="nil"/>
-              <w:bottom w:val="nil"/>
-              <w:right w:val="nil"/>
-            </w:tcBorders>
-            <w:noWrap w:val="0"/>
-            <w:tcMar>
-              <w:top w:w="-1" w:type="dxa"/>
-              <w:left w:w="-1" w:type="dxa"/>
-              <w:bottom w:w="-1" w:type="dxa"/>
-              <w:right w:w="-1" w:type="dxa"/>
-            </w:tcMar>
-            <w:vAlign w:val="center"/>
+            <w:tcW w:w="1701" w:type="dxa"/>
           </w:tcPr>
           <w:p>
             <w:pPr>
-              <w:snapToGrid w:val="0"/>
-              <w:spacing w:line="240" w:lineRule="auto"/>
-              <w:ind w:left="0" w:leftChars="0" w:right="0" w:rightChars="0" w:firstLine="0" w:firstLineChars="0"/>
-              <w:jc w:val="center"/>
-              <w:rPr>
-                <w:b/>
-              </w:rPr>
+              <w:spacing w:after="0" w:line="240" w:lineRule="auto"/>
             </w:pPr>
             <w:r>
               <w:rPr>
+                <w:rFonts w:ascii="Times New Roman" w:hAnsi="Times New Roman" w:eastAsia="Times New Roman"/>
                 <w:b/>
+                <w:i w:val="0"/>
+                <w:sz w:val="18"/>
               </w:rPr>
-              <w:t>Discovery evidence</w:t>
+              <w:t>Expression-scale stable</w:t>
             </w:r>
           </w:p>
         </w:tc>
         <w:tc>
           <w:tcPr>
-            <w:tcW w:w="628" w:type="pct"/>
-            <w:tcBorders>
-              <w:top w:val="single" w:color="auto" w:sz="12" w:space="0"/>
-              <w:left w:val="nil"/>
-              <w:bottom w:val="nil"/>
-              <w:right w:val="nil"/>
-            </w:tcBorders>
-            <w:noWrap w:val="0"/>
-            <w:tcMar>
-              <w:top w:w="-1" w:type="dxa"/>
-              <w:left w:w="-1" w:type="dxa"/>
-              <w:bottom w:w="-1" w:type="dxa"/>
-              <w:right w:w="-1" w:type="dxa"/>
-            </w:tcMar>
-            <w:vAlign w:val="center"/>
+            <w:tcW w:w="1474" w:type="dxa"/>
           </w:tcPr>
           <w:p>
             <w:pPr>
-              <w:snapToGrid w:val="0"/>
-              <w:spacing w:line="240" w:lineRule="auto"/>
-              <w:ind w:left="0" w:leftChars="0" w:right="0" w:rightChars="0" w:firstLine="0" w:firstLineChars="0"/>
-              <w:jc w:val="center"/>
-              <w:rPr>
-                <w:b/>
-              </w:rPr>
+              <w:spacing w:after="0" w:line="240" w:lineRule="auto"/>
             </w:pPr>
             <w:r>
               <w:rPr>
+                <w:rFonts w:ascii="Times New Roman" w:hAnsi="Times New Roman" w:eastAsia="Times New Roman"/>
                 <w:b/>
+                <w:i w:val="0"/>
+                <w:sz w:val="18"/>
               </w:rPr>
-              <w:t>In silico perturbation evidence</w:t>
+              <w:t>Donor concordance</w:t>
             </w:r>
           </w:p>
         </w:tc>
         <w:tc>
           <w:tcPr>
-            <w:tcW w:w="1033" w:type="pct"/>
-            <w:tcBorders>
-              <w:top w:val="single" w:color="auto" w:sz="12" w:space="0"/>
-              <w:left w:val="nil"/>
-              <w:bottom w:val="nil"/>
-              <w:right w:val="nil"/>
-            </w:tcBorders>
-            <w:noWrap w:val="0"/>
-            <w:tcMar>
-              <w:top w:w="-1" w:type="dxa"/>
-              <w:left w:w="-1" w:type="dxa"/>
-              <w:bottom w:w="-1" w:type="dxa"/>
-              <w:right w:w="-1" w:type="dxa"/>
-            </w:tcMar>
-            <w:vAlign w:val="center"/>
+            <w:tcW w:w="1928" w:type="dxa"/>
           </w:tcPr>
           <w:p>
             <w:pPr>
-              <w:snapToGrid w:val="0"/>
-              <w:spacing w:line="240" w:lineRule="auto"/>
-              <w:ind w:left="0" w:leftChars="0" w:right="0" w:rightChars="0" w:firstLine="0" w:firstLineChars="0"/>
-              <w:jc w:val="center"/>
-              <w:rPr>
-                <w:b/>
-              </w:rPr>
+              <w:spacing w:after="0" w:line="240" w:lineRule="auto"/>
             </w:pPr>
             <w:r>
               <w:rPr>
+                <w:rFonts w:ascii="Times New Roman" w:hAnsi="Times New Roman" w:eastAsia="Times New Roman"/>
                 <w:b/>
+                <w:i w:val="0"/>
+                <w:sz w:val="18"/>
               </w:rPr>
-              <w:t>Robustness/supportive evidence</w:t>
+              <w:t>Threshold retention</w:t>
             </w:r>
           </w:p>
         </w:tc>
         <w:tc>
           <w:tcPr>
-            <w:tcW w:w="1138" w:type="pct"/>
-            <w:tcBorders>
-              <w:top w:val="single" w:color="auto" w:sz="12" w:space="0"/>
-              <w:left w:val="nil"/>
-              <w:bottom w:val="nil"/>
-              <w:right w:val="nil"/>
-            </w:tcBorders>
-            <w:noWrap w:val="0"/>
-            <w:tcMar>
-              <w:top w:w="-1" w:type="dxa"/>
-              <w:left w:w="-1" w:type="dxa"/>
-              <w:bottom w:w="-1" w:type="dxa"/>
-              <w:right w:w="-1" w:type="dxa"/>
-            </w:tcMar>
-            <w:vAlign w:val="center"/>
+            <w:tcW w:w="4309" w:type="dxa"/>
           </w:tcPr>
           <w:p>
             <w:pPr>
-              <w:snapToGrid w:val="0"/>
-              <w:spacing w:line="240" w:lineRule="auto"/>
-              <w:ind w:left="0" w:leftChars="0" w:right="0" w:rightChars="0" w:firstLine="0" w:firstLineChars="0"/>
-              <w:jc w:val="center"/>
-              <w:rPr>
-                <w:b/>
-              </w:rPr>
+              <w:spacing w:after="0" w:line="240" w:lineRule="auto"/>
             </w:pPr>
             <w:r>
               <w:rPr>
+                <w:rFonts w:ascii="Times New Roman" w:hAnsi="Times New Roman" w:eastAsia="Times New Roman"/>
                 <w:b/>
+                <w:i w:val="0"/>
+                <w:sz w:val="18"/>
               </w:rPr>
-              <w:t>Program interpretation</w:t>
+              <w:t>Network-edge change</w:t>
             </w:r>
           </w:p>
         </w:tc>
         <w:tc>
           <w:tcPr>
-            <w:tcW w:w="627" w:type="pct"/>
-            <w:tcBorders>
-              <w:top w:val="single" w:color="auto" w:sz="12" w:space="0"/>
-              <w:left w:val="nil"/>
-              <w:bottom w:val="nil"/>
-              <w:right w:val="nil"/>
-            </w:tcBorders>
-            <w:noWrap w:val="0"/>
-            <w:tcMar>
-              <w:top w:w="-1" w:type="dxa"/>
-              <w:left w:w="-1" w:type="dxa"/>
-              <w:bottom w:w="-1" w:type="dxa"/>
-              <w:right w:w="-1" w:type="dxa"/>
-            </w:tcMar>
-            <w:vAlign w:val="center"/>
+            <w:tcW w:w="2494" w:type="dxa"/>
           </w:tcPr>
           <w:p>
             <w:pPr>
-              <w:snapToGrid w:val="0"/>
-              <w:spacing w:line="240" w:lineRule="auto"/>
-              <w:ind w:left="0" w:leftChars="0" w:right="0" w:rightChars="0" w:firstLine="0" w:firstLineChars="0"/>
-              <w:jc w:val="center"/>
-              <w:rPr>
-                <w:b/>
-              </w:rPr>
+              <w:spacing w:after="0" w:line="240" w:lineRule="auto"/>
             </w:pPr>
             <w:r>
               <w:rPr>
+                <w:rFonts w:ascii="Times New Roman" w:hAnsi="Times New Roman" w:eastAsia="Times New Roman"/>
                 <w:b/>
+                <w:i w:val="0"/>
+                <w:sz w:val="18"/>
               </w:rPr>
-              <w:t>Final priority</w:t>
+              <w:t>Regulon-target enrichment</w:t>
+            </w:r>
+          </w:p>
+        </w:tc>
+        <w:tc>
+          <w:tcPr>
+            <w:tcW w:w="1571" w:type="dxa"/>
+          </w:tcPr>
+          <w:p>
+            <w:pPr>
+              <w:spacing w:after="0" w:line="240" w:lineRule="auto"/>
+            </w:pPr>
+            <w:r>
+              <w:rPr>
+                <w:rFonts w:ascii="Times New Roman" w:hAnsi="Times New Roman" w:eastAsia="Times New Roman"/>
+                <w:b/>
+                <w:i w:val="0"/>
+                <w:sz w:val="18"/>
+              </w:rPr>
+              <w:t>Priority</w:t>
             </w:r>
           </w:p>
         </w:tc>
       </w:tr>
       <w:tr>
         <w:tblPrEx>
+          <w:tblBorders>
+            <w:top w:val="single" w:color="auto" w:sz="4" w:space="0"/>
+            <w:left w:val="single" w:color="auto" w:sz="4" w:space="0"/>
+            <w:bottom w:val="single" w:color="auto" w:sz="4" w:space="0"/>
+            <w:right w:val="single" w:color="auto" w:sz="4" w:space="0"/>
+            <w:insideH w:val="single" w:color="auto" w:sz="4" w:space="0"/>
+            <w:insideV w:val="single" w:color="auto" w:sz="4" w:space="0"/>
+          </w:tblBorders>
           <w:tblCellMar>
             <w:top w:w="0" w:type="dxa"/>
             <w:left w:w="108" w:type="dxa"/>
@@ -311,215 +258,175 @@
           </w:tblCellMar>
         </w:tblPrEx>
         <w:trPr>
-          <w:trHeight w:val="0" w:hRule="atLeast"/>
           <w:jc w:val="center"/>
         </w:trPr>
         <w:tc>
           <w:tcPr>
-            <w:tcW w:w="502" w:type="pct"/>
-            <w:tcBorders>
-              <w:top w:val="single" w:color="auto" w:sz="4" w:space="0"/>
-              <w:left w:val="nil"/>
-              <w:bottom w:val="nil"/>
-              <w:right w:val="nil"/>
-            </w:tcBorders>
-            <w:noWrap w:val="0"/>
-            <w:tcMar>
-              <w:top w:w="-1" w:type="dxa"/>
-              <w:left w:w="-1" w:type="dxa"/>
-              <w:bottom w:w="-1" w:type="dxa"/>
-              <w:right w:w="-1" w:type="dxa"/>
-            </w:tcMar>
-            <w:vAlign w:val="center"/>
+            <w:tcW w:w="1587" w:type="dxa"/>
           </w:tcPr>
           <w:p>
             <w:pPr>
-              <w:snapToGrid w:val="0"/>
-              <w:spacing w:line="240" w:lineRule="auto"/>
-              <w:ind w:left="0" w:leftChars="0" w:right="0" w:rightChars="0" w:firstLine="0" w:firstLineChars="0"/>
-              <w:jc w:val="center"/>
+              <w:spacing w:after="0" w:line="240" w:lineRule="auto"/>
             </w:pPr>
             <w:r>
+              <w:rPr>
+                <w:rFonts w:ascii="Times New Roman" w:hAnsi="Times New Roman" w:eastAsia="Times New Roman"/>
+                <w:b w:val="0"/>
+                <w:i w:val="0"/>
+                <w:sz w:val="18"/>
+              </w:rPr>
               <w:t>NFE2L2</w:t>
             </w:r>
           </w:p>
         </w:tc>
         <w:tc>
           <w:tcPr>
-            <w:tcW w:w="526" w:type="pct"/>
-            <w:tcBorders>
-              <w:top w:val="single" w:color="auto" w:sz="4" w:space="0"/>
-              <w:left w:val="nil"/>
-              <w:bottom w:val="nil"/>
-              <w:right w:val="nil"/>
-            </w:tcBorders>
-            <w:noWrap w:val="0"/>
-            <w:tcMar>
-              <w:top w:w="-1" w:type="dxa"/>
-              <w:left w:w="-1" w:type="dxa"/>
-              <w:bottom w:w="-1" w:type="dxa"/>
-              <w:right w:w="-1" w:type="dxa"/>
-            </w:tcMar>
-            <w:vAlign w:val="center"/>
+            <w:tcW w:w="1361" w:type="dxa"/>
           </w:tcPr>
           <w:p>
             <w:pPr>
-              <w:snapToGrid w:val="0"/>
-              <w:spacing w:line="240" w:lineRule="auto"/>
-              <w:ind w:left="0" w:leftChars="0" w:right="0" w:rightChars="0" w:firstLine="0" w:firstLineChars="0"/>
-              <w:jc w:val="center"/>
+              <w:spacing w:after="0" w:line="240" w:lineRule="auto"/>
             </w:pPr>
             <w:r>
+              <w:rPr>
+                <w:rFonts w:ascii="Times New Roman" w:hAnsi="Times New Roman" w:eastAsia="Times New Roman"/>
+                <w:b w:val="0"/>
+                <w:i w:val="0"/>
+                <w:sz w:val="18"/>
+              </w:rPr>
+              <w:t>B</w:t>
+            </w:r>
+          </w:p>
+        </w:tc>
+        <w:tc>
+          <w:tcPr>
+            <w:tcW w:w="1928" w:type="dxa"/>
+          </w:tcPr>
+          <w:p>
+            <w:pPr>
+              <w:spacing w:after="0" w:line="240" w:lineRule="auto"/>
+            </w:pPr>
+            <w:r>
+              <w:rPr>
+                <w:rFonts w:ascii="Times New Roman" w:hAnsi="Times New Roman" w:eastAsia="Times New Roman"/>
+                <w:b w:val="0"/>
+                <w:i w:val="0"/>
+                <w:sz w:val="18"/>
+              </w:rPr>
               <w:t>Lesion-associated</w:t>
             </w:r>
           </w:p>
         </w:tc>
         <w:tc>
           <w:tcPr>
-            <w:tcW w:w="543" w:type="pct"/>
-            <w:tcBorders>
-              <w:top w:val="single" w:color="auto" w:sz="4" w:space="0"/>
-              <w:left w:val="nil"/>
-              <w:bottom w:val="nil"/>
-              <w:right w:val="nil"/>
-            </w:tcBorders>
-            <w:noWrap w:val="0"/>
-            <w:tcMar>
-              <w:top w:w="-1" w:type="dxa"/>
-              <w:left w:w="-1" w:type="dxa"/>
-              <w:bottom w:w="-1" w:type="dxa"/>
-              <w:right w:w="-1" w:type="dxa"/>
-            </w:tcMar>
-            <w:vAlign w:val="center"/>
+            <w:tcW w:w="1701" w:type="dxa"/>
           </w:tcPr>
           <w:p>
             <w:pPr>
-              <w:snapToGrid w:val="0"/>
-              <w:spacing w:line="240" w:lineRule="auto"/>
-              <w:ind w:left="0" w:leftChars="0" w:right="0" w:rightChars="0" w:firstLine="0" w:firstLineChars="0"/>
-              <w:jc w:val="center"/>
+              <w:spacing w:after="0" w:line="240" w:lineRule="auto"/>
             </w:pPr>
             <w:r>
-              <w:t>Lesion-side expression and regulon activity</w:t>
+              <w:rPr>
+                <w:rFonts w:ascii="Times New Roman" w:hAnsi="Times New Roman" w:eastAsia="Times New Roman"/>
+                <w:b w:val="0"/>
+                <w:i w:val="0"/>
+                <w:sz w:val="18"/>
+              </w:rPr>
+              <w:t>Yes</w:t>
             </w:r>
           </w:p>
         </w:tc>
         <w:tc>
           <w:tcPr>
-            <w:tcW w:w="628" w:type="pct"/>
-            <w:tcBorders>
-              <w:top w:val="single" w:color="auto" w:sz="4" w:space="0"/>
-              <w:left w:val="nil"/>
-              <w:bottom w:val="nil"/>
-              <w:right w:val="nil"/>
-            </w:tcBorders>
-            <w:noWrap w:val="0"/>
-            <w:tcMar>
-              <w:top w:w="-1" w:type="dxa"/>
-              <w:left w:w="-1" w:type="dxa"/>
-              <w:bottom w:w="-1" w:type="dxa"/>
-              <w:right w:w="-1" w:type="dxa"/>
-            </w:tcMar>
-            <w:vAlign w:val="center"/>
+            <w:tcW w:w="1474" w:type="dxa"/>
           </w:tcPr>
           <w:p>
             <w:pPr>
-              <w:snapToGrid w:val="0"/>
-              <w:spacing w:line="240" w:lineRule="auto"/>
-              <w:ind w:left="0" w:leftChars="0" w:right="0" w:rightChars="0" w:firstLine="0" w:firstLineChars="0"/>
-              <w:jc w:val="center"/>
+              <w:spacing w:after="0" w:line="240" w:lineRule="auto"/>
             </w:pPr>
             <w:r>
-              <w:t>Highest mean shift; Approx. RI rank 2</w:t>
+              <w:rPr>
+                <w:rFonts w:ascii="Times New Roman" w:hAnsi="Times New Roman" w:eastAsia="Times New Roman"/>
+                <w:b w:val="0"/>
+                <w:i w:val="0"/>
+                <w:sz w:val="18"/>
+              </w:rPr>
+              <w:t>Concordant</w:t>
             </w:r>
           </w:p>
         </w:tc>
         <w:tc>
           <w:tcPr>
-            <w:tcW w:w="1033" w:type="pct"/>
-            <w:tcBorders>
-              <w:top w:val="single" w:color="auto" w:sz="4" w:space="0"/>
-              <w:left w:val="nil"/>
-              <w:bottom w:val="nil"/>
-              <w:right w:val="nil"/>
-            </w:tcBorders>
-            <w:noWrap w:val="0"/>
-            <w:tcMar>
-              <w:top w:w="-1" w:type="dxa"/>
-              <w:left w:w="-1" w:type="dxa"/>
-              <w:bottom w:w="-1" w:type="dxa"/>
-              <w:right w:w="-1" w:type="dxa"/>
-            </w:tcMar>
-            <w:vAlign w:val="center"/>
+            <w:tcW w:w="1928" w:type="dxa"/>
           </w:tcPr>
           <w:p>
             <w:pPr>
-              <w:snapToGrid w:val="0"/>
-              <w:spacing w:line="240" w:lineRule="auto"/>
-              <w:ind w:left="0" w:leftChars="0" w:right="0" w:rightChars="0" w:firstLine="0" w:firstLineChars="0"/>
-              <w:jc w:val="center"/>
+              <w:spacing w:after="0" w:line="240" w:lineRule="auto"/>
             </w:pPr>
             <w:r>
-              <w:t>Stable internal direction; disease-side contextual support</w:t>
+              <w:rPr>
+                <w:rFonts w:ascii="Times New Roman" w:hAnsi="Times New Roman" w:eastAsia="Times New Roman"/>
+                <w:b w:val="0"/>
+                <w:i w:val="0"/>
+                <w:sz w:val="18"/>
+              </w:rPr>
+              <w:t>66.7%</w:t>
             </w:r>
           </w:p>
         </w:tc>
         <w:tc>
           <w:tcPr>
-            <w:tcW w:w="1138" w:type="pct"/>
-            <w:tcBorders>
-              <w:top w:val="single" w:color="auto" w:sz="4" w:space="0"/>
-              <w:left w:val="nil"/>
-              <w:bottom w:val="nil"/>
-              <w:right w:val="nil"/>
-            </w:tcBorders>
-            <w:noWrap w:val="0"/>
-            <w:tcMar>
-              <w:top w:w="-1" w:type="dxa"/>
-              <w:left w:w="-1" w:type="dxa"/>
-              <w:bottom w:w="-1" w:type="dxa"/>
-              <w:right w:w="-1" w:type="dxa"/>
-            </w:tcMar>
-            <w:vAlign w:val="center"/>
+            <w:tcW w:w="4309" w:type="dxa"/>
           </w:tcPr>
           <w:p>
             <w:pPr>
-              <w:snapToGrid w:val="0"/>
-              <w:spacing w:line="240" w:lineRule="auto"/>
-              <w:ind w:left="0" w:leftChars="0" w:right="0" w:rightChars="0" w:firstLine="0" w:firstLineChars="0"/>
-              <w:jc w:val="center"/>
+              <w:spacing w:after="0" w:line="240" w:lineRule="auto"/>
             </w:pPr>
             <w:r>
-              <w:t>Stress response and transcriptional reprogramming</w:t>
+              <w:rPr>
+                <w:rFonts w:ascii="Times New Roman" w:hAnsi="Times New Roman" w:eastAsia="Times New Roman"/>
+                <w:b w:val="0"/>
+                <w:i w:val="0"/>
+                <w:sz w:val="18"/>
+              </w:rPr>
+              <w:t>-5.6% (most stable)</w:t>
             </w:r>
           </w:p>
         </w:tc>
         <w:tc>
           <w:tcPr>
-            <w:tcW w:w="627" w:type="pct"/>
-            <w:tcBorders>
-              <w:top w:val="single" w:color="auto" w:sz="4" w:space="0"/>
-              <w:left w:val="nil"/>
-              <w:bottom w:val="nil"/>
-              <w:right w:val="nil"/>
-            </w:tcBorders>
-            <w:noWrap w:val="0"/>
-            <w:tcMar>
-              <w:top w:w="-1" w:type="dxa"/>
-              <w:left w:w="-1" w:type="dxa"/>
-              <w:bottom w:w="-1" w:type="dxa"/>
-              <w:right w:w="-1" w:type="dxa"/>
-            </w:tcMar>
-            <w:vAlign w:val="center"/>
+            <w:tcW w:w="2494" w:type="dxa"/>
           </w:tcPr>
           <w:p>
             <w:pPr>
-              <w:snapToGrid w:val="0"/>
-              <w:spacing w:line="240" w:lineRule="auto"/>
-              <w:ind w:left="0" w:leftChars="0" w:right="0" w:rightChars="0" w:firstLine="0" w:firstLineChars="0"/>
-              <w:jc w:val="center"/>
+              <w:spacing w:after="0" w:line="240" w:lineRule="auto"/>
             </w:pPr>
             <w:r>
+              <w:rPr>
+                <w:rFonts w:hint="eastAsia" w:ascii="Times New Roman" w:hAnsi="Times New Roman" w:eastAsia="Times New Roman"/>
+                <w:b w:val="0"/>
+                <w:i w:val="0"/>
+                <w:sz w:val="18"/>
+              </w:rPr>
+              <w:t>Yes: transcription regulation and MAPK signalling</w:t>
+            </w:r>
+          </w:p>
+        </w:tc>
+        <w:tc>
+          <w:tcPr>
+            <w:tcW w:w="1571" w:type="dxa"/>
+          </w:tcPr>
+          <w:p>
+            <w:pPr>
+              <w:spacing w:after="0" w:line="240" w:lineRule="auto"/>
+            </w:pPr>
+            <w:r>
+              <w:rPr>
+                <w:rFonts w:ascii="Times New Roman" w:hAnsi="Times New Roman" w:eastAsia="Times New Roman"/>
+                <w:b w:val="0"/>
+                <w:i w:val="0"/>
+                <w:sz w:val="18"/>
+              </w:rPr>
               <w:t>Primary lesion-associated axis</w:t>
             </w:r>
           </w:p>
@@ -527,6 +434,14 @@
       </w:tr>
       <w:tr>
         <w:tblPrEx>
+          <w:tblBorders>
+            <w:top w:val="single" w:color="auto" w:sz="4" w:space="0"/>
+            <w:left w:val="single" w:color="auto" w:sz="4" w:space="0"/>
+            <w:bottom w:val="single" w:color="auto" w:sz="4" w:space="0"/>
+            <w:right w:val="single" w:color="auto" w:sz="4" w:space="0"/>
+            <w:insideH w:val="single" w:color="auto" w:sz="4" w:space="0"/>
+            <w:insideV w:val="single" w:color="auto" w:sz="4" w:space="0"/>
+          </w:tblBorders>
           <w:tblCellMar>
             <w:top w:w="0" w:type="dxa"/>
             <w:left w:w="108" w:type="dxa"/>
@@ -535,222 +450,190 @@
           </w:tblCellMar>
         </w:tblPrEx>
         <w:trPr>
-          <w:trHeight w:val="0" w:hRule="atLeast"/>
           <w:jc w:val="center"/>
         </w:trPr>
         <w:tc>
           <w:tcPr>
-            <w:tcW w:w="502" w:type="pct"/>
-            <w:tcBorders>
-              <w:top w:val="nil"/>
-              <w:left w:val="nil"/>
-              <w:bottom w:val="nil"/>
-              <w:right w:val="nil"/>
-            </w:tcBorders>
-            <w:noWrap w:val="0"/>
-            <w:tcMar>
-              <w:top w:w="-1" w:type="dxa"/>
-              <w:left w:w="-1" w:type="dxa"/>
-              <w:bottom w:w="-1" w:type="dxa"/>
-              <w:right w:w="-1" w:type="dxa"/>
-            </w:tcMar>
-            <w:vAlign w:val="center"/>
+            <w:tcW w:w="1587" w:type="dxa"/>
           </w:tcPr>
           <w:p>
             <w:pPr>
-              <w:snapToGrid w:val="0"/>
-              <w:spacing w:line="240" w:lineRule="auto"/>
-              <w:ind w:left="0" w:leftChars="0" w:right="0" w:rightChars="0" w:firstLine="0" w:firstLineChars="0"/>
-              <w:jc w:val="center"/>
+              <w:spacing w:after="0" w:line="240" w:lineRule="auto"/>
             </w:pPr>
             <w:r>
+              <w:rPr>
+                <w:rFonts w:ascii="Times New Roman" w:hAnsi="Times New Roman" w:eastAsia="Times New Roman"/>
+                <w:b w:val="0"/>
+                <w:i w:val="0"/>
+                <w:sz w:val="18"/>
+              </w:rPr>
               <w:t>THRB</w:t>
             </w:r>
           </w:p>
         </w:tc>
         <w:tc>
           <w:tcPr>
-            <w:tcW w:w="526" w:type="pct"/>
-            <w:tcBorders>
-              <w:top w:val="nil"/>
-              <w:left w:val="nil"/>
-              <w:bottom w:val="nil"/>
-              <w:right w:val="nil"/>
-            </w:tcBorders>
-            <w:noWrap w:val="0"/>
-            <w:tcMar>
-              <w:top w:w="-1" w:type="dxa"/>
-              <w:left w:w="-1" w:type="dxa"/>
-              <w:bottom w:w="-1" w:type="dxa"/>
-              <w:right w:w="-1" w:type="dxa"/>
-            </w:tcMar>
-            <w:vAlign w:val="center"/>
+            <w:tcW w:w="1361" w:type="dxa"/>
           </w:tcPr>
           <w:p>
             <w:pPr>
-              <w:snapToGrid w:val="0"/>
-              <w:spacing w:line="240" w:lineRule="auto"/>
-              <w:ind w:left="0" w:leftChars="0" w:right="0" w:rightChars="0" w:firstLine="0" w:firstLineChars="0"/>
-              <w:jc w:val="center"/>
+              <w:spacing w:after="0" w:line="240" w:lineRule="auto"/>
             </w:pPr>
             <w:r>
-              <w:t>Internal-control-associated</w:t>
+              <w:rPr>
+                <w:rFonts w:ascii="Times New Roman" w:hAnsi="Times New Roman" w:eastAsia="Times New Roman"/>
+                <w:b w:val="0"/>
+                <w:i w:val="0"/>
+                <w:sz w:val="18"/>
+              </w:rPr>
+              <w:t>B</w:t>
             </w:r>
           </w:p>
         </w:tc>
         <w:tc>
           <w:tcPr>
-            <w:tcW w:w="543" w:type="pct"/>
-            <w:tcBorders>
-              <w:top w:val="nil"/>
-              <w:left w:val="nil"/>
-              <w:bottom w:val="nil"/>
-              <w:right w:val="nil"/>
-            </w:tcBorders>
-            <w:noWrap w:val="0"/>
-            <w:tcMar>
-              <w:top w:w="-1" w:type="dxa"/>
-              <w:left w:w="-1" w:type="dxa"/>
-              <w:bottom w:w="-1" w:type="dxa"/>
-              <w:right w:w="-1" w:type="dxa"/>
-            </w:tcMar>
-            <w:vAlign w:val="center"/>
+            <w:tcW w:w="1928" w:type="dxa"/>
           </w:tcPr>
           <w:p>
             <w:pPr>
-              <w:snapToGrid w:val="0"/>
-              <w:spacing w:line="240" w:lineRule="auto"/>
-              <w:ind w:left="0" w:leftChars="0" w:right="0" w:rightChars="0" w:firstLine="0" w:firstLineChars="0"/>
-              <w:jc w:val="center"/>
+              <w:spacing w:after="0" w:line="240" w:lineRule="auto"/>
             </w:pPr>
             <w:r>
-              <w:t>Internal-control-side regulon activity</w:t>
+              <w:rPr>
+                <w:rFonts w:ascii="Times New Roman" w:hAnsi="Times New Roman" w:eastAsia="Times New Roman"/>
+                <w:b w:val="0"/>
+                <w:i w:val="0"/>
+                <w:sz w:val="18"/>
+              </w:rPr>
+              <w:t>Reduced in lesion tissue</w:t>
             </w:r>
           </w:p>
         </w:tc>
         <w:tc>
           <w:tcPr>
-            <w:tcW w:w="628" w:type="pct"/>
-            <w:tcBorders>
-              <w:top w:val="nil"/>
-              <w:left w:val="nil"/>
-              <w:bottom w:val="nil"/>
-              <w:right w:val="nil"/>
-            </w:tcBorders>
-            <w:noWrap w:val="0"/>
-            <w:tcMar>
-              <w:top w:w="-1" w:type="dxa"/>
-              <w:left w:w="-1" w:type="dxa"/>
-              <w:bottom w:w="-1" w:type="dxa"/>
-              <w:right w:w="-1" w:type="dxa"/>
-            </w:tcMar>
-            <w:vAlign w:val="center"/>
+            <w:tcW w:w="1701" w:type="dxa"/>
           </w:tcPr>
           <w:p>
             <w:pPr>
-              <w:snapToGrid w:val="0"/>
-              <w:spacing w:line="240" w:lineRule="auto"/>
-              <w:ind w:left="0" w:leftChars="0" w:right="0" w:rightChars="0" w:firstLine="0" w:firstLineChars="0"/>
-              <w:jc w:val="center"/>
+              <w:spacing w:after="0" w:line="240" w:lineRule="auto"/>
             </w:pPr>
             <w:r>
-              <w:t>Highest Approx. RI; mean shift rank 2</w:t>
+              <w:rPr>
+                <w:rFonts w:ascii="Times New Roman" w:hAnsi="Times New Roman" w:eastAsia="Times New Roman"/>
+                <w:b w:val="0"/>
+                <w:i w:val="0"/>
+                <w:sz w:val="18"/>
+              </w:rPr>
+              <w:t>Yes</w:t>
             </w:r>
           </w:p>
         </w:tc>
         <w:tc>
           <w:tcPr>
-            <w:tcW w:w="1033" w:type="pct"/>
-            <w:tcBorders>
-              <w:top w:val="nil"/>
-              <w:left w:val="nil"/>
-              <w:bottom w:val="nil"/>
-              <w:right w:val="nil"/>
-            </w:tcBorders>
-            <w:noWrap w:val="0"/>
-            <w:tcMar>
-              <w:top w:w="-1" w:type="dxa"/>
-              <w:left w:w="-1" w:type="dxa"/>
-              <w:bottom w:w="-1" w:type="dxa"/>
-              <w:right w:w="-1" w:type="dxa"/>
-            </w:tcMar>
-            <w:vAlign w:val="center"/>
+            <w:tcW w:w="1474" w:type="dxa"/>
           </w:tcPr>
           <w:p>
             <w:pPr>
-              <w:snapToGrid w:val="0"/>
-              <w:spacing w:line="240" w:lineRule="auto"/>
-              <w:ind w:left="0" w:leftChars="0" w:right="0" w:rightChars="0" w:firstLine="0" w:firstLineChars="0"/>
-              <w:jc w:val="center"/>
+              <w:spacing w:after="0" w:line="240" w:lineRule="auto"/>
             </w:pPr>
             <w:r>
-              <w:t>Stable internal direction; partial control-like supportive signal</w:t>
+              <w:rPr>
+                <w:rFonts w:ascii="Times New Roman" w:hAnsi="Times New Roman" w:eastAsia="Times New Roman"/>
+                <w:b w:val="0"/>
+                <w:i w:val="0"/>
+                <w:sz w:val="18"/>
+              </w:rPr>
+              <w:t>Concordant</w:t>
             </w:r>
           </w:p>
         </w:tc>
         <w:tc>
           <w:tcPr>
-            <w:tcW w:w="1138" w:type="pct"/>
-            <w:tcBorders>
-              <w:top w:val="nil"/>
-              <w:left w:val="nil"/>
-              <w:bottom w:val="nil"/>
-              <w:right w:val="nil"/>
-            </w:tcBorders>
-            <w:noWrap w:val="0"/>
-            <w:tcMar>
-              <w:top w:w="-1" w:type="dxa"/>
-              <w:left w:w="-1" w:type="dxa"/>
-              <w:bottom w:w="-1" w:type="dxa"/>
-              <w:right w:w="-1" w:type="dxa"/>
-            </w:tcMar>
-            <w:vAlign w:val="center"/>
+            <w:tcW w:w="1928" w:type="dxa"/>
           </w:tcPr>
           <w:p>
             <w:pPr>
-              <w:snapToGrid w:val="0"/>
-              <w:spacing w:line="240" w:lineRule="auto"/>
-              <w:ind w:left="0" w:leftChars="0" w:right="0" w:rightChars="0" w:firstLine="0" w:firstLineChars="0"/>
-              <w:jc w:val="center"/>
+              <w:spacing w:after="0" w:line="240" w:lineRule="auto"/>
             </w:pPr>
             <w:r>
-              <w:t>Homeostatic, synaptic and calcium-related support</w:t>
+              <w:rPr>
+                <w:rFonts w:ascii="Times New Roman" w:hAnsi="Times New Roman" w:eastAsia="Times New Roman"/>
+                <w:b w:val="0"/>
+                <w:i w:val="0"/>
+                <w:sz w:val="18"/>
+              </w:rPr>
+              <w:t>100%</w:t>
             </w:r>
           </w:p>
         </w:tc>
         <w:tc>
           <w:tcPr>
-            <w:tcW w:w="627" w:type="pct"/>
-            <w:tcBorders>
-              <w:top w:val="nil"/>
-              <w:left w:val="nil"/>
-              <w:bottom w:val="nil"/>
-              <w:right w:val="nil"/>
-            </w:tcBorders>
-            <w:noWrap w:val="0"/>
-            <w:tcMar>
-              <w:top w:w="-1" w:type="dxa"/>
-              <w:left w:w="-1" w:type="dxa"/>
-              <w:bottom w:w="-1" w:type="dxa"/>
-              <w:right w:w="-1" w:type="dxa"/>
-            </w:tcMar>
-            <w:vAlign w:val="center"/>
+            <w:tcW w:w="4309" w:type="dxa"/>
           </w:tcPr>
           <w:p>
             <w:pPr>
-              <w:snapToGrid w:val="0"/>
-              <w:spacing w:line="240" w:lineRule="auto"/>
-              <w:ind w:left="0" w:leftChars="0" w:right="0" w:rightChars="0" w:firstLine="0" w:firstLineChars="0"/>
-              <w:jc w:val="center"/>
+              <w:spacing w:after="0" w:line="240" w:lineRule="auto"/>
             </w:pPr>
             <w:r>
-              <w:t>Primary homeostatic-support program</w:t>
+              <w:rPr>
+                <w:rFonts w:ascii="Times New Roman" w:hAnsi="Times New Roman" w:eastAsia="Times New Roman"/>
+                <w:b w:val="0"/>
+                <w:i w:val="0"/>
+                <w:sz w:val="18"/>
+              </w:rPr>
+              <w:t>-17.6%</w:t>
+            </w:r>
+          </w:p>
+        </w:tc>
+        <w:tc>
+          <w:tcPr>
+            <w:tcW w:w="2494" w:type="dxa"/>
+          </w:tcPr>
+          <w:p>
+            <w:pPr>
+              <w:spacing w:after="0" w:line="240" w:lineRule="auto"/>
+            </w:pPr>
+            <w:r>
+              <w:rPr>
+                <w:rFonts w:ascii="Times New Roman" w:hAnsi="Times New Roman" w:eastAsia="Times New Roman"/>
+                <w:b w:val="0"/>
+                <w:i w:val="0"/>
+                <w:sz w:val="18"/>
+              </w:rPr>
+              <w:t>Yes: calcium-regulated neurotransmitter exocytosis, dendrite extension and synaptic vesicle cycle</w:t>
+            </w:r>
+          </w:p>
+        </w:tc>
+        <w:tc>
+          <w:tcPr>
+            <w:tcW w:w="1571" w:type="dxa"/>
+          </w:tcPr>
+          <w:p>
+            <w:pPr>
+              <w:spacing w:after="0" w:line="240" w:lineRule="auto"/>
+            </w:pPr>
+            <w:r>
+              <w:rPr>
+                <w:rFonts w:ascii="Times New Roman" w:hAnsi="Times New Roman" w:eastAsia="Times New Roman"/>
+                <w:b w:val="0"/>
+                <w:i w:val="0"/>
+                <w:sz w:val="18"/>
+              </w:rPr>
+              <w:t>Primary homeostatic program reduced in lesion tissue</w:t>
             </w:r>
           </w:p>
         </w:tc>
       </w:tr>
       <w:tr>
         <w:tblPrEx>
+          <w:tblBorders>
+            <w:top w:val="single" w:color="auto" w:sz="4" w:space="0"/>
+            <w:left w:val="single" w:color="auto" w:sz="4" w:space="0"/>
+            <w:bottom w:val="single" w:color="auto" w:sz="4" w:space="0"/>
+            <w:right w:val="single" w:color="auto" w:sz="4" w:space="0"/>
+            <w:insideH w:val="single" w:color="auto" w:sz="4" w:space="0"/>
+            <w:insideV w:val="single" w:color="auto" w:sz="4" w:space="0"/>
+          </w:tblBorders>
           <w:tblCellMar>
             <w:top w:w="0" w:type="dxa"/>
             <w:left w:w="108" w:type="dxa"/>
@@ -759,222 +642,190 @@
           </w:tblCellMar>
         </w:tblPrEx>
         <w:trPr>
-          <w:trHeight w:val="0" w:hRule="atLeast"/>
           <w:jc w:val="center"/>
         </w:trPr>
         <w:tc>
           <w:tcPr>
-            <w:tcW w:w="502" w:type="pct"/>
-            <w:tcBorders>
-              <w:top w:val="nil"/>
-              <w:left w:val="nil"/>
-              <w:bottom w:val="nil"/>
-              <w:right w:val="nil"/>
-            </w:tcBorders>
-            <w:noWrap w:val="0"/>
-            <w:tcMar>
-              <w:top w:w="-1" w:type="dxa"/>
-              <w:left w:w="-1" w:type="dxa"/>
-              <w:bottom w:w="-1" w:type="dxa"/>
-              <w:right w:w="-1" w:type="dxa"/>
-            </w:tcMar>
-            <w:vAlign w:val="center"/>
+            <w:tcW w:w="1587" w:type="dxa"/>
           </w:tcPr>
           <w:p>
             <w:pPr>
-              <w:snapToGrid w:val="0"/>
-              <w:spacing w:line="240" w:lineRule="auto"/>
-              <w:ind w:left="0" w:leftChars="0" w:right="0" w:rightChars="0" w:firstLine="0" w:firstLineChars="0"/>
-              <w:jc w:val="center"/>
+              <w:spacing w:after="0" w:line="240" w:lineRule="auto"/>
             </w:pPr>
             <w:r>
-              <w:t>BHLHE40</w:t>
+              <w:rPr>
+                <w:rFonts w:ascii="Times New Roman" w:hAnsi="Times New Roman" w:eastAsia="Times New Roman"/>
+                <w:b w:val="0"/>
+                <w:i w:val="0"/>
+                <w:sz w:val="18"/>
+              </w:rPr>
+              <w:t>SATB2</w:t>
             </w:r>
           </w:p>
         </w:tc>
         <w:tc>
           <w:tcPr>
-            <w:tcW w:w="526" w:type="pct"/>
-            <w:tcBorders>
-              <w:top w:val="nil"/>
-              <w:left w:val="nil"/>
-              <w:bottom w:val="nil"/>
-              <w:right w:val="nil"/>
-            </w:tcBorders>
-            <w:noWrap w:val="0"/>
-            <w:tcMar>
-              <w:top w:w="-1" w:type="dxa"/>
-              <w:left w:w="-1" w:type="dxa"/>
-              <w:bottom w:w="-1" w:type="dxa"/>
-              <w:right w:w="-1" w:type="dxa"/>
-            </w:tcMar>
-            <w:vAlign w:val="center"/>
+            <w:tcW w:w="1361" w:type="dxa"/>
           </w:tcPr>
           <w:p>
             <w:pPr>
-              <w:snapToGrid w:val="0"/>
-              <w:spacing w:line="240" w:lineRule="auto"/>
-              <w:ind w:left="0" w:leftChars="0" w:right="0" w:rightChars="0" w:firstLine="0" w:firstLineChars="0"/>
-              <w:jc w:val="center"/>
+              <w:spacing w:after="0" w:line="240" w:lineRule="auto"/>
             </w:pPr>
             <w:r>
-              <w:t>Lesion-associated</w:t>
+              <w:rPr>
+                <w:rFonts w:ascii="Times New Roman" w:hAnsi="Times New Roman" w:eastAsia="Times New Roman"/>
+                <w:b w:val="0"/>
+                <w:i w:val="0"/>
+                <w:sz w:val="18"/>
+              </w:rPr>
+              <w:t>A</w:t>
             </w:r>
           </w:p>
         </w:tc>
         <w:tc>
           <w:tcPr>
-            <w:tcW w:w="543" w:type="pct"/>
-            <w:tcBorders>
-              <w:top w:val="nil"/>
-              <w:left w:val="nil"/>
-              <w:bottom w:val="nil"/>
-              <w:right w:val="nil"/>
-            </w:tcBorders>
-            <w:noWrap w:val="0"/>
-            <w:tcMar>
-              <w:top w:w="-1" w:type="dxa"/>
-              <w:left w:w="-1" w:type="dxa"/>
-              <w:bottom w:w="-1" w:type="dxa"/>
-              <w:right w:w="-1" w:type="dxa"/>
-            </w:tcMar>
-            <w:vAlign w:val="center"/>
+            <w:tcW w:w="1928" w:type="dxa"/>
           </w:tcPr>
           <w:p>
             <w:pPr>
-              <w:snapToGrid w:val="0"/>
-              <w:spacing w:line="240" w:lineRule="auto"/>
-              <w:ind w:left="0" w:leftChars="0" w:right="0" w:rightChars="0" w:firstLine="0" w:firstLineChars="0"/>
-              <w:jc w:val="center"/>
+              <w:spacing w:after="0" w:line="240" w:lineRule="auto"/>
             </w:pPr>
             <w:r>
-              <w:t>Lesion-side expression and regulon activity</w:t>
+              <w:rPr>
+                <w:rFonts w:ascii="Times New Roman" w:hAnsi="Times New Roman" w:eastAsia="Times New Roman"/>
+                <w:b w:val="0"/>
+                <w:i w:val="0"/>
+                <w:sz w:val="18"/>
+              </w:rPr>
+              <w:t>Reduced in lesion tissue</w:t>
             </w:r>
           </w:p>
         </w:tc>
         <w:tc>
           <w:tcPr>
-            <w:tcW w:w="628" w:type="pct"/>
-            <w:tcBorders>
-              <w:top w:val="nil"/>
-              <w:left w:val="nil"/>
-              <w:bottom w:val="nil"/>
-              <w:right w:val="nil"/>
-            </w:tcBorders>
-            <w:noWrap w:val="0"/>
-            <w:tcMar>
-              <w:top w:w="-1" w:type="dxa"/>
-              <w:left w:w="-1" w:type="dxa"/>
-              <w:bottom w:w="-1" w:type="dxa"/>
-              <w:right w:w="-1" w:type="dxa"/>
-            </w:tcMar>
-            <w:vAlign w:val="center"/>
+            <w:tcW w:w="1701" w:type="dxa"/>
           </w:tcPr>
           <w:p>
             <w:pPr>
-              <w:snapToGrid w:val="0"/>
-              <w:spacing w:line="240" w:lineRule="auto"/>
-              <w:ind w:left="0" w:leftChars="0" w:right="0" w:rightChars="0" w:firstLine="0" w:firstLineChars="0"/>
-              <w:jc w:val="center"/>
+              <w:spacing w:after="0" w:line="240" w:lineRule="auto"/>
             </w:pPr>
             <w:r>
-              <w:t>Intermediate perturbation effect</w:t>
+              <w:rPr>
+                <w:rFonts w:ascii="Times New Roman" w:hAnsi="Times New Roman" w:eastAsia="Times New Roman"/>
+                <w:b w:val="0"/>
+                <w:i w:val="0"/>
+                <w:sz w:val="18"/>
+              </w:rPr>
+              <w:t>Yes</w:t>
             </w:r>
           </w:p>
         </w:tc>
         <w:tc>
           <w:tcPr>
-            <w:tcW w:w="1033" w:type="pct"/>
-            <w:tcBorders>
-              <w:top w:val="nil"/>
-              <w:left w:val="nil"/>
-              <w:bottom w:val="nil"/>
-              <w:right w:val="nil"/>
-            </w:tcBorders>
-            <w:noWrap w:val="0"/>
-            <w:tcMar>
-              <w:top w:w="-1" w:type="dxa"/>
-              <w:left w:w="-1" w:type="dxa"/>
-              <w:bottom w:w="-1" w:type="dxa"/>
-              <w:right w:w="-1" w:type="dxa"/>
-            </w:tcMar>
-            <w:vAlign w:val="center"/>
+            <w:tcW w:w="1474" w:type="dxa"/>
           </w:tcPr>
           <w:p>
             <w:pPr>
-              <w:snapToGrid w:val="0"/>
-              <w:spacing w:line="240" w:lineRule="auto"/>
-              <w:ind w:left="0" w:leftChars="0" w:right="0" w:rightChars="0" w:firstLine="0" w:firstLineChars="0"/>
-              <w:jc w:val="center"/>
+              <w:spacing w:after="0" w:line="240" w:lineRule="auto"/>
             </w:pPr>
             <w:r>
-              <w:t>Stable internal evidence; weaker external support</w:t>
+              <w:rPr>
+                <w:rFonts w:ascii="Times New Roman" w:hAnsi="Times New Roman" w:eastAsia="Times New Roman"/>
+                <w:b w:val="0"/>
+                <w:i w:val="0"/>
+                <w:sz w:val="18"/>
+              </w:rPr>
+              <w:t>Concordant</w:t>
             </w:r>
           </w:p>
         </w:tc>
         <w:tc>
           <w:tcPr>
-            <w:tcW w:w="1138" w:type="pct"/>
-            <w:tcBorders>
-              <w:top w:val="nil"/>
-              <w:left w:val="nil"/>
-              <w:bottom w:val="nil"/>
-              <w:right w:val="nil"/>
-            </w:tcBorders>
-            <w:noWrap w:val="0"/>
-            <w:tcMar>
-              <w:top w:w="-1" w:type="dxa"/>
-              <w:left w:w="-1" w:type="dxa"/>
-              <w:bottom w:w="-1" w:type="dxa"/>
-              <w:right w:w="-1" w:type="dxa"/>
-            </w:tcMar>
-            <w:vAlign w:val="center"/>
+            <w:tcW w:w="1928" w:type="dxa"/>
           </w:tcPr>
           <w:p>
             <w:pPr>
-              <w:snapToGrid w:val="0"/>
-              <w:spacing w:line="240" w:lineRule="auto"/>
-              <w:ind w:left="0" w:leftChars="0" w:right="0" w:rightChars="0" w:firstLine="0" w:firstLineChars="0"/>
-              <w:jc w:val="center"/>
+              <w:spacing w:after="0" w:line="240" w:lineRule="auto"/>
             </w:pPr>
             <w:r>
-              <w:t>Secondary stress/inflammatory response program</w:t>
+              <w:rPr>
+                <w:rFonts w:ascii="Times New Roman" w:hAnsi="Times New Roman" w:eastAsia="Times New Roman"/>
+                <w:b w:val="0"/>
+                <w:i w:val="0"/>
+                <w:sz w:val="18"/>
+              </w:rPr>
+              <w:t>100%</w:t>
             </w:r>
           </w:p>
         </w:tc>
         <w:tc>
           <w:tcPr>
-            <w:tcW w:w="627" w:type="pct"/>
-            <w:tcBorders>
-              <w:top w:val="nil"/>
-              <w:left w:val="nil"/>
-              <w:bottom w:val="nil"/>
-              <w:right w:val="nil"/>
-            </w:tcBorders>
-            <w:noWrap w:val="0"/>
-            <w:tcMar>
-              <w:top w:w="-1" w:type="dxa"/>
-              <w:left w:w="-1" w:type="dxa"/>
-              <w:bottom w:w="-1" w:type="dxa"/>
-              <w:right w:w="-1" w:type="dxa"/>
-            </w:tcMar>
-            <w:vAlign w:val="center"/>
+            <w:tcW w:w="4309" w:type="dxa"/>
           </w:tcPr>
           <w:p>
             <w:pPr>
-              <w:snapToGrid w:val="0"/>
-              <w:spacing w:line="240" w:lineRule="auto"/>
-              <w:ind w:left="0" w:leftChars="0" w:right="0" w:rightChars="0" w:firstLine="0" w:firstLineChars="0"/>
-              <w:jc w:val="center"/>
+              <w:spacing w:after="0" w:line="240" w:lineRule="auto"/>
             </w:pPr>
             <w:r>
-              <w:t>Secondary lesion-associated factor</w:t>
+              <w:rPr>
+                <w:rFonts w:ascii="Times New Roman" w:hAnsi="Times New Roman" w:eastAsia="Times New Roman"/>
+                <w:b w:val="0"/>
+                <w:i w:val="0"/>
+                <w:sz w:val="18"/>
+              </w:rPr>
+              <w:t>-13.0%</w:t>
+            </w:r>
+          </w:p>
+        </w:tc>
+        <w:tc>
+          <w:tcPr>
+            <w:tcW w:w="2494" w:type="dxa"/>
+          </w:tcPr>
+          <w:p>
+            <w:pPr>
+              <w:spacing w:after="0" w:line="240" w:lineRule="auto"/>
+            </w:pPr>
+            <w:r>
+              <w:rPr>
+                <w:rFonts w:ascii="Times New Roman" w:hAnsi="Times New Roman" w:eastAsia="Times New Roman"/>
+                <w:b w:val="0"/>
+                <w:i w:val="0"/>
+                <w:sz w:val="18"/>
+              </w:rPr>
+              <w:t>Yes: morphogenesis and axon guidance</w:t>
+            </w:r>
+          </w:p>
+        </w:tc>
+        <w:tc>
+          <w:tcPr>
+            <w:tcW w:w="1571" w:type="dxa"/>
+          </w:tcPr>
+          <w:p>
+            <w:pPr>
+              <w:spacing w:after="0" w:line="240" w:lineRule="auto"/>
+            </w:pPr>
+            <w:r>
+              <w:rPr>
+                <w:rFonts w:ascii="Times New Roman" w:hAnsi="Times New Roman" w:eastAsia="Times New Roman"/>
+                <w:b w:val="0"/>
+                <w:i w:val="0"/>
+                <w:sz w:val="18"/>
+              </w:rPr>
+              <w:t>Supportive</w:t>
             </w:r>
           </w:p>
         </w:tc>
       </w:tr>
       <w:tr>
         <w:tblPrEx>
+          <w:tblBorders>
+            <w:top w:val="single" w:color="auto" w:sz="4" w:space="0"/>
+            <w:left w:val="single" w:color="auto" w:sz="4" w:space="0"/>
+            <w:bottom w:val="single" w:color="auto" w:sz="4" w:space="0"/>
+            <w:right w:val="single" w:color="auto" w:sz="4" w:space="0"/>
+            <w:insideH w:val="single" w:color="auto" w:sz="4" w:space="0"/>
+            <w:insideV w:val="single" w:color="auto" w:sz="4" w:space="0"/>
+          </w:tblBorders>
           <w:tblCellMar>
             <w:top w:w="0" w:type="dxa"/>
             <w:left w:w="108" w:type="dxa"/>
@@ -983,225 +834,791 @@
           </w:tblCellMar>
         </w:tblPrEx>
         <w:trPr>
-          <w:trHeight w:val="0" w:hRule="atLeast"/>
           <w:jc w:val="center"/>
         </w:trPr>
         <w:tc>
           <w:tcPr>
-            <w:tcW w:w="502" w:type="pct"/>
-            <w:tcBorders>
-              <w:top w:val="nil"/>
-              <w:left w:val="nil"/>
-              <w:bottom w:val="single" w:color="auto" w:sz="12" w:space="0"/>
-              <w:right w:val="nil"/>
-            </w:tcBorders>
-            <w:noWrap w:val="0"/>
-            <w:tcMar>
-              <w:top w:w="-1" w:type="dxa"/>
-              <w:left w:w="-1" w:type="dxa"/>
-              <w:bottom w:w="-1" w:type="dxa"/>
-              <w:right w:w="-1" w:type="dxa"/>
-            </w:tcMar>
-            <w:vAlign w:val="center"/>
+            <w:tcW w:w="1587" w:type="dxa"/>
           </w:tcPr>
           <w:p>
             <w:pPr>
-              <w:snapToGrid w:val="0"/>
-              <w:spacing w:line="240" w:lineRule="auto"/>
-              <w:ind w:left="0" w:leftChars="0" w:right="0" w:rightChars="0" w:firstLine="0" w:firstLineChars="0"/>
-              <w:jc w:val="center"/>
+              <w:spacing w:after="0" w:line="240" w:lineRule="auto"/>
             </w:pPr>
             <w:r>
+              <w:rPr>
+                <w:rFonts w:ascii="Times New Roman" w:hAnsi="Times New Roman" w:eastAsia="Times New Roman"/>
+                <w:b w:val="0"/>
+                <w:i w:val="0"/>
+                <w:sz w:val="18"/>
+              </w:rPr>
+              <w:t>SMAD3</w:t>
+            </w:r>
+          </w:p>
+        </w:tc>
+        <w:tc>
+          <w:tcPr>
+            <w:tcW w:w="1361" w:type="dxa"/>
+          </w:tcPr>
+          <w:p>
+            <w:pPr>
+              <w:spacing w:after="0" w:line="240" w:lineRule="auto"/>
+            </w:pPr>
+            <w:r>
+              <w:rPr>
+                <w:rFonts w:ascii="Times New Roman" w:hAnsi="Times New Roman" w:eastAsia="Times New Roman"/>
+                <w:b w:val="0"/>
+                <w:i w:val="0"/>
+                <w:sz w:val="18"/>
+              </w:rPr>
+              <w:t>B</w:t>
+            </w:r>
+          </w:p>
+        </w:tc>
+        <w:tc>
+          <w:tcPr>
+            <w:tcW w:w="1928" w:type="dxa"/>
+          </w:tcPr>
+          <w:p>
+            <w:pPr>
+              <w:spacing w:after="0" w:line="240" w:lineRule="auto"/>
+            </w:pPr>
+            <w:r>
+              <w:rPr>
+                <w:rFonts w:ascii="Times New Roman" w:hAnsi="Times New Roman" w:eastAsia="Times New Roman"/>
+                <w:b w:val="0"/>
+                <w:i w:val="0"/>
+                <w:sz w:val="18"/>
+              </w:rPr>
+              <w:t>Reduced in lesion tissue</w:t>
+            </w:r>
+          </w:p>
+        </w:tc>
+        <w:tc>
+          <w:tcPr>
+            <w:tcW w:w="1701" w:type="dxa"/>
+          </w:tcPr>
+          <w:p>
+            <w:pPr>
+              <w:spacing w:after="0" w:line="240" w:lineRule="auto"/>
+            </w:pPr>
+            <w:r>
+              <w:rPr>
+                <w:rFonts w:ascii="Times New Roman" w:hAnsi="Times New Roman" w:eastAsia="Times New Roman"/>
+                <w:b w:val="0"/>
+                <w:i w:val="0"/>
+                <w:sz w:val="18"/>
+              </w:rPr>
+              <w:t>No (linear scale |L| = 0.193)</w:t>
+            </w:r>
+          </w:p>
+        </w:tc>
+        <w:tc>
+          <w:tcPr>
+            <w:tcW w:w="1474" w:type="dxa"/>
+          </w:tcPr>
+          <w:p>
+            <w:pPr>
+              <w:spacing w:after="0" w:line="240" w:lineRule="auto"/>
+            </w:pPr>
+            <w:r>
+              <w:rPr>
+                <w:rFonts w:ascii="Times New Roman" w:hAnsi="Times New Roman" w:eastAsia="Times New Roman"/>
+                <w:b w:val="0"/>
+                <w:i w:val="0"/>
+                <w:sz w:val="18"/>
+              </w:rPr>
+              <w:t>Discordant</w:t>
+            </w:r>
+          </w:p>
+        </w:tc>
+        <w:tc>
+          <w:tcPr>
+            <w:tcW w:w="1928" w:type="dxa"/>
+          </w:tcPr>
+          <w:p>
+            <w:pPr>
+              <w:spacing w:after="0" w:line="240" w:lineRule="auto"/>
+            </w:pPr>
+            <w:r>
+              <w:rPr>
+                <w:rFonts w:ascii="Times New Roman" w:hAnsi="Times New Roman" w:eastAsia="Times New Roman"/>
+                <w:b w:val="0"/>
+                <w:i w:val="0"/>
+                <w:sz w:val="18"/>
+              </w:rPr>
+              <w:t>66.7%</w:t>
+            </w:r>
+          </w:p>
+        </w:tc>
+        <w:tc>
+          <w:tcPr>
+            <w:tcW w:w="4309" w:type="dxa"/>
+          </w:tcPr>
+          <w:p>
+            <w:pPr>
+              <w:spacing w:after="0" w:line="240" w:lineRule="auto"/>
+            </w:pPr>
+            <w:r>
+              <w:rPr>
+                <w:rFonts w:ascii="Times New Roman" w:hAnsi="Times New Roman" w:eastAsia="Times New Roman"/>
+                <w:b w:val="0"/>
+                <w:i w:val="0"/>
+                <w:sz w:val="18"/>
+              </w:rPr>
+              <w:t>-7.4%</w:t>
+            </w:r>
+          </w:p>
+        </w:tc>
+        <w:tc>
+          <w:tcPr>
+            <w:tcW w:w="2494" w:type="dxa"/>
+          </w:tcPr>
+          <w:p>
+            <w:pPr>
+              <w:spacing w:after="0" w:line="240" w:lineRule="auto"/>
+            </w:pPr>
+            <w:r>
+              <w:rPr>
+                <w:rFonts w:ascii="Times New Roman" w:hAnsi="Times New Roman" w:eastAsia="Times New Roman"/>
+                <w:b w:val="0"/>
+                <w:i w:val="0"/>
+                <w:sz w:val="18"/>
+              </w:rPr>
+              <w:t>Yes: synaptic transmission and axon guidance</w:t>
+            </w:r>
+          </w:p>
+        </w:tc>
+        <w:tc>
+          <w:tcPr>
+            <w:tcW w:w="1571" w:type="dxa"/>
+          </w:tcPr>
+          <w:p>
+            <w:pPr>
+              <w:spacing w:after="0" w:line="240" w:lineRule="auto"/>
+            </w:pPr>
+            <w:r>
+              <w:rPr>
+                <w:rFonts w:ascii="Times New Roman" w:hAnsi="Times New Roman" w:eastAsia="Times New Roman"/>
+                <w:b w:val="0"/>
+                <w:i w:val="0"/>
+                <w:sz w:val="18"/>
+              </w:rPr>
+              <w:t>Supportive, least reproducible</w:t>
+            </w:r>
+          </w:p>
+        </w:tc>
+      </w:tr>
+      <w:tr>
+        <w:tblPrEx>
+          <w:tblBorders>
+            <w:top w:val="single" w:color="auto" w:sz="4" w:space="0"/>
+            <w:left w:val="single" w:color="auto" w:sz="4" w:space="0"/>
+            <w:bottom w:val="single" w:color="auto" w:sz="4" w:space="0"/>
+            <w:right w:val="single" w:color="auto" w:sz="4" w:space="0"/>
+            <w:insideH w:val="single" w:color="auto" w:sz="4" w:space="0"/>
+            <w:insideV w:val="single" w:color="auto" w:sz="4" w:space="0"/>
+          </w:tblBorders>
+          <w:tblCellMar>
+            <w:top w:w="0" w:type="dxa"/>
+            <w:left w:w="108" w:type="dxa"/>
+            <w:bottom w:w="0" w:type="dxa"/>
+            <w:right w:w="108" w:type="dxa"/>
+          </w:tblCellMar>
+        </w:tblPrEx>
+        <w:trPr>
+          <w:jc w:val="center"/>
+        </w:trPr>
+        <w:tc>
+          <w:tcPr>
+            <w:tcW w:w="1587" w:type="dxa"/>
+          </w:tcPr>
+          <w:p>
+            <w:pPr>
+              <w:spacing w:after="0" w:line="240" w:lineRule="auto"/>
+            </w:pPr>
+            <w:r>
+              <w:rPr>
+                <w:rFonts w:ascii="Times New Roman" w:hAnsi="Times New Roman" w:eastAsia="Times New Roman"/>
+                <w:b w:val="0"/>
+                <w:i w:val="0"/>
+                <w:sz w:val="18"/>
+              </w:rPr>
               <w:t>SOX2</w:t>
             </w:r>
           </w:p>
         </w:tc>
         <w:tc>
           <w:tcPr>
-            <w:tcW w:w="526" w:type="pct"/>
-            <w:tcBorders>
-              <w:top w:val="nil"/>
-              <w:left w:val="nil"/>
-              <w:bottom w:val="single" w:color="auto" w:sz="12" w:space="0"/>
-              <w:right w:val="nil"/>
-            </w:tcBorders>
-            <w:noWrap w:val="0"/>
-            <w:tcMar>
-              <w:top w:w="-1" w:type="dxa"/>
-              <w:left w:w="-1" w:type="dxa"/>
-              <w:bottom w:w="-1" w:type="dxa"/>
-              <w:right w:w="-1" w:type="dxa"/>
-            </w:tcMar>
-            <w:vAlign w:val="center"/>
+            <w:tcW w:w="1361" w:type="dxa"/>
           </w:tcPr>
           <w:p>
             <w:pPr>
-              <w:snapToGrid w:val="0"/>
-              <w:spacing w:line="240" w:lineRule="auto"/>
-              <w:ind w:left="0" w:leftChars="0" w:right="0" w:rightChars="0" w:firstLine="0" w:firstLineChars="0"/>
-              <w:jc w:val="center"/>
+              <w:spacing w:after="0" w:line="240" w:lineRule="auto"/>
             </w:pPr>
             <w:r>
+              <w:rPr>
+                <w:rFonts w:ascii="Times New Roman" w:hAnsi="Times New Roman" w:eastAsia="Times New Roman"/>
+                <w:b w:val="0"/>
+                <w:i w:val="0"/>
+                <w:sz w:val="18"/>
+              </w:rPr>
+              <w:t>A</w:t>
+            </w:r>
+          </w:p>
+        </w:tc>
+        <w:tc>
+          <w:tcPr>
+            <w:tcW w:w="1928" w:type="dxa"/>
+          </w:tcPr>
+          <w:p>
+            <w:pPr>
+              <w:spacing w:after="0" w:line="240" w:lineRule="auto"/>
+            </w:pPr>
+            <w:r>
+              <w:rPr>
+                <w:rFonts w:ascii="Times New Roman" w:hAnsi="Times New Roman" w:eastAsia="Times New Roman"/>
+                <w:b w:val="0"/>
+                <w:i w:val="0"/>
+                <w:sz w:val="18"/>
+              </w:rPr>
               <w:t>Lesion-associated</w:t>
             </w:r>
           </w:p>
         </w:tc>
         <w:tc>
           <w:tcPr>
-            <w:tcW w:w="543" w:type="pct"/>
-            <w:tcBorders>
-              <w:top w:val="nil"/>
-              <w:left w:val="nil"/>
-              <w:bottom w:val="single" w:color="auto" w:sz="12" w:space="0"/>
-              <w:right w:val="nil"/>
-            </w:tcBorders>
-            <w:noWrap w:val="0"/>
-            <w:tcMar>
-              <w:top w:w="-1" w:type="dxa"/>
-              <w:left w:w="-1" w:type="dxa"/>
-              <w:bottom w:w="-1" w:type="dxa"/>
-              <w:right w:w="-1" w:type="dxa"/>
-            </w:tcMar>
-            <w:vAlign w:val="center"/>
+            <w:tcW w:w="1701" w:type="dxa"/>
           </w:tcPr>
           <w:p>
             <w:pPr>
-              <w:snapToGrid w:val="0"/>
-              <w:spacing w:line="240" w:lineRule="auto"/>
-              <w:ind w:left="0" w:leftChars="0" w:right="0" w:rightChars="0" w:firstLine="0" w:firstLineChars="0"/>
-              <w:jc w:val="center"/>
+              <w:spacing w:after="0" w:line="240" w:lineRule="auto"/>
             </w:pPr>
             <w:r>
-              <w:t>Lesion-side expression and regulon activity</w:t>
+              <w:rPr>
+                <w:rFonts w:ascii="Times New Roman" w:hAnsi="Times New Roman" w:eastAsia="Times New Roman"/>
+                <w:b w:val="0"/>
+                <w:i w:val="0"/>
+                <w:sz w:val="18"/>
+              </w:rPr>
+              <w:t>Yes</w:t>
             </w:r>
           </w:p>
         </w:tc>
         <w:tc>
           <w:tcPr>
-            <w:tcW w:w="628" w:type="pct"/>
-            <w:tcBorders>
-              <w:top w:val="nil"/>
-              <w:left w:val="nil"/>
-              <w:bottom w:val="single" w:color="auto" w:sz="12" w:space="0"/>
-              <w:right w:val="nil"/>
-            </w:tcBorders>
-            <w:noWrap w:val="0"/>
-            <w:tcMar>
-              <w:top w:w="-1" w:type="dxa"/>
-              <w:left w:w="-1" w:type="dxa"/>
-              <w:bottom w:w="-1" w:type="dxa"/>
-              <w:right w:w="-1" w:type="dxa"/>
-            </w:tcMar>
-            <w:vAlign w:val="center"/>
+            <w:tcW w:w="1474" w:type="dxa"/>
           </w:tcPr>
           <w:p>
             <w:pPr>
-              <w:snapToGrid w:val="0"/>
-              <w:spacing w:line="240" w:lineRule="auto"/>
-              <w:ind w:left="0" w:leftChars="0" w:right="0" w:rightChars="0" w:firstLine="0" w:firstLineChars="0"/>
-              <w:jc w:val="center"/>
+              <w:spacing w:after="0" w:line="240" w:lineRule="auto"/>
             </w:pPr>
             <w:r>
-              <w:t>Lowest perturbation effect among the four candidates</w:t>
+              <w:rPr>
+                <w:rFonts w:ascii="Times New Roman" w:hAnsi="Times New Roman" w:eastAsia="Times New Roman"/>
+                <w:b w:val="0"/>
+                <w:i w:val="0"/>
+                <w:sz w:val="18"/>
+              </w:rPr>
+              <w:t>Concordant</w:t>
             </w:r>
           </w:p>
         </w:tc>
         <w:tc>
           <w:tcPr>
-            <w:tcW w:w="1033" w:type="pct"/>
-            <w:tcBorders>
-              <w:top w:val="nil"/>
-              <w:left w:val="nil"/>
-              <w:bottom w:val="single" w:color="auto" w:sz="12" w:space="0"/>
-              <w:right w:val="nil"/>
-            </w:tcBorders>
-            <w:noWrap w:val="0"/>
-            <w:tcMar>
-              <w:top w:w="-1" w:type="dxa"/>
-              <w:left w:w="-1" w:type="dxa"/>
-              <w:bottom w:w="-1" w:type="dxa"/>
-              <w:right w:w="-1" w:type="dxa"/>
-            </w:tcMar>
-            <w:vAlign w:val="center"/>
+            <w:tcW w:w="1928" w:type="dxa"/>
           </w:tcPr>
           <w:p>
             <w:pPr>
-              <w:snapToGrid w:val="0"/>
-              <w:spacing w:line="240" w:lineRule="auto"/>
-              <w:ind w:left="0" w:leftChars="0" w:right="0" w:rightChars="0" w:firstLine="0" w:firstLineChars="0"/>
-              <w:jc w:val="center"/>
+              <w:spacing w:after="0" w:line="240" w:lineRule="auto"/>
             </w:pPr>
             <w:r>
-              <w:t>Stable internal evidence; target-limited support</w:t>
+              <w:rPr>
+                <w:rFonts w:ascii="Times New Roman" w:hAnsi="Times New Roman" w:eastAsia="Times New Roman"/>
+                <w:b w:val="0"/>
+                <w:i w:val="0"/>
+                <w:sz w:val="18"/>
+              </w:rPr>
+              <w:t>66.7%</w:t>
             </w:r>
           </w:p>
         </w:tc>
         <w:tc>
           <w:tcPr>
-            <w:tcW w:w="1138" w:type="pct"/>
-            <w:tcBorders>
-              <w:top w:val="nil"/>
-              <w:left w:val="nil"/>
-              <w:bottom w:val="single" w:color="auto" w:sz="12" w:space="0"/>
-              <w:right w:val="nil"/>
-            </w:tcBorders>
-            <w:noWrap w:val="0"/>
-            <w:tcMar>
-              <w:top w:w="-1" w:type="dxa"/>
-              <w:left w:w="-1" w:type="dxa"/>
-              <w:bottom w:w="-1" w:type="dxa"/>
-              <w:right w:w="-1" w:type="dxa"/>
-            </w:tcMar>
-            <w:vAlign w:val="center"/>
+            <w:tcW w:w="4309" w:type="dxa"/>
           </w:tcPr>
           <w:p>
             <w:pPr>
-              <w:snapToGrid w:val="0"/>
-              <w:spacing w:line="240" w:lineRule="auto"/>
-              <w:ind w:left="0" w:leftChars="0" w:right="0" w:rightChars="0" w:firstLine="0" w:firstLineChars="0"/>
-              <w:jc w:val="center"/>
+              <w:spacing w:after="0" w:line="240" w:lineRule="auto"/>
             </w:pPr>
             <w:r>
-              <w:t>Developmental/plasticity-related retained program</w:t>
+              <w:rPr>
+                <w:rFonts w:ascii="Times New Roman" w:hAnsi="Times New Roman" w:eastAsia="Times New Roman"/>
+                <w:b w:val="0"/>
+                <w:i w:val="0"/>
+                <w:sz w:val="18"/>
+              </w:rPr>
+              <w:t>-39.0%</w:t>
             </w:r>
           </w:p>
         </w:tc>
         <w:tc>
           <w:tcPr>
-            <w:tcW w:w="627" w:type="pct"/>
-            <w:tcBorders>
-              <w:top w:val="nil"/>
-              <w:left w:val="nil"/>
-              <w:bottom w:val="single" w:color="auto" w:sz="12" w:space="0"/>
-              <w:right w:val="nil"/>
-            </w:tcBorders>
-            <w:noWrap w:val="0"/>
-            <w:tcMar>
-              <w:top w:w="-1" w:type="dxa"/>
-              <w:left w:w="-1" w:type="dxa"/>
-              <w:bottom w:w="-1" w:type="dxa"/>
-              <w:right w:w="-1" w:type="dxa"/>
-            </w:tcMar>
-            <w:vAlign w:val="center"/>
+            <w:tcW w:w="2494" w:type="dxa"/>
           </w:tcPr>
           <w:p>
             <w:pPr>
-              <w:snapToGrid w:val="0"/>
-              <w:spacing w:line="240" w:lineRule="auto"/>
-              <w:ind w:left="0" w:leftChars="0" w:right="0" w:rightChars="0" w:firstLine="0" w:firstLineChars="0"/>
-              <w:jc w:val="center"/>
+              <w:spacing w:after="0" w:line="240" w:lineRule="auto"/>
             </w:pPr>
             <w:r>
-              <w:t>Retained lower-priority factor</w:t>
+              <w:rPr>
+                <w:rFonts w:ascii="Times New Roman" w:hAnsi="Times New Roman" w:eastAsia="Times New Roman"/>
+                <w:b w:val="0"/>
+                <w:i w:val="0"/>
+                <w:sz w:val="18"/>
+              </w:rPr>
+              <w:t>No regulon-target term; two GO terms in the direction-consistent intersection</w:t>
+            </w:r>
+          </w:p>
+        </w:tc>
+        <w:tc>
+          <w:tcPr>
+            <w:tcW w:w="1571" w:type="dxa"/>
+          </w:tcPr>
+          <w:p>
+            <w:pPr>
+              <w:spacing w:after="0" w:line="240" w:lineRule="auto"/>
+            </w:pPr>
+            <w:r>
+              <w:rPr>
+                <w:rFonts w:ascii="Times New Roman" w:hAnsi="Times New Roman" w:eastAsia="Times New Roman"/>
+                <w:b w:val="0"/>
+                <w:i w:val="0"/>
+                <w:sz w:val="18"/>
+              </w:rPr>
+              <w:t>Retained, target-limited</w:t>
+            </w:r>
+          </w:p>
+        </w:tc>
+      </w:tr>
+      <w:tr>
+        <w:tblPrEx>
+          <w:tblBorders>
+            <w:top w:val="single" w:color="auto" w:sz="4" w:space="0"/>
+            <w:left w:val="single" w:color="auto" w:sz="4" w:space="0"/>
+            <w:bottom w:val="single" w:color="auto" w:sz="4" w:space="0"/>
+            <w:right w:val="single" w:color="auto" w:sz="4" w:space="0"/>
+            <w:insideH w:val="single" w:color="auto" w:sz="4" w:space="0"/>
+            <w:insideV w:val="single" w:color="auto" w:sz="4" w:space="0"/>
+          </w:tblBorders>
+          <w:tblCellMar>
+            <w:top w:w="0" w:type="dxa"/>
+            <w:left w:w="108" w:type="dxa"/>
+            <w:bottom w:w="0" w:type="dxa"/>
+            <w:right w:w="108" w:type="dxa"/>
+          </w:tblCellMar>
+        </w:tblPrEx>
+        <w:trPr>
+          <w:jc w:val="center"/>
+        </w:trPr>
+        <w:tc>
+          <w:tcPr>
+            <w:tcW w:w="1587" w:type="dxa"/>
+          </w:tcPr>
+          <w:p>
+            <w:pPr>
+              <w:spacing w:after="0" w:line="240" w:lineRule="auto"/>
+            </w:pPr>
+            <w:r>
+              <w:rPr>
+                <w:rFonts w:ascii="Times New Roman" w:hAnsi="Times New Roman" w:eastAsia="Times New Roman"/>
+                <w:b w:val="0"/>
+                <w:i w:val="0"/>
+                <w:sz w:val="18"/>
+              </w:rPr>
+              <w:t>SOX10</w:t>
+            </w:r>
+          </w:p>
+        </w:tc>
+        <w:tc>
+          <w:tcPr>
+            <w:tcW w:w="1361" w:type="dxa"/>
+          </w:tcPr>
+          <w:p>
+            <w:pPr>
+              <w:spacing w:after="0" w:line="240" w:lineRule="auto"/>
+            </w:pPr>
+            <w:r>
+              <w:rPr>
+                <w:rFonts w:ascii="Times New Roman" w:hAnsi="Times New Roman" w:eastAsia="Times New Roman"/>
+                <w:b w:val="0"/>
+                <w:i w:val="0"/>
+                <w:sz w:val="18"/>
+              </w:rPr>
+              <w:t>A</w:t>
+            </w:r>
+          </w:p>
+        </w:tc>
+        <w:tc>
+          <w:tcPr>
+            <w:tcW w:w="1928" w:type="dxa"/>
+          </w:tcPr>
+          <w:p>
+            <w:pPr>
+              <w:spacing w:after="0" w:line="240" w:lineRule="auto"/>
+            </w:pPr>
+            <w:r>
+              <w:rPr>
+                <w:rFonts w:ascii="Times New Roman" w:hAnsi="Times New Roman" w:eastAsia="Times New Roman"/>
+                <w:b w:val="0"/>
+                <w:i w:val="0"/>
+                <w:sz w:val="18"/>
+              </w:rPr>
+              <w:t>Reduced in lesion tissue</w:t>
+            </w:r>
+          </w:p>
+        </w:tc>
+        <w:tc>
+          <w:tcPr>
+            <w:tcW w:w="1701" w:type="dxa"/>
+          </w:tcPr>
+          <w:p>
+            <w:pPr>
+              <w:spacing w:after="0" w:line="240" w:lineRule="auto"/>
+            </w:pPr>
+            <w:r>
+              <w:rPr>
+                <w:rFonts w:ascii="Times New Roman" w:hAnsi="Times New Roman" w:eastAsia="Times New Roman"/>
+                <w:b w:val="0"/>
+                <w:i w:val="0"/>
+                <w:sz w:val="18"/>
+              </w:rPr>
+              <w:t>Yes</w:t>
+            </w:r>
+          </w:p>
+        </w:tc>
+        <w:tc>
+          <w:tcPr>
+            <w:tcW w:w="1474" w:type="dxa"/>
+          </w:tcPr>
+          <w:p>
+            <w:pPr>
+              <w:spacing w:after="0" w:line="240" w:lineRule="auto"/>
+            </w:pPr>
+            <w:r>
+              <w:rPr>
+                <w:rFonts w:ascii="Times New Roman" w:hAnsi="Times New Roman" w:eastAsia="Times New Roman"/>
+                <w:b w:val="0"/>
+                <w:i w:val="0"/>
+                <w:sz w:val="18"/>
+              </w:rPr>
+              <w:t>Concordant</w:t>
+            </w:r>
+          </w:p>
+        </w:tc>
+        <w:tc>
+          <w:tcPr>
+            <w:tcW w:w="1928" w:type="dxa"/>
+          </w:tcPr>
+          <w:p>
+            <w:pPr>
+              <w:spacing w:after="0" w:line="240" w:lineRule="auto"/>
+            </w:pPr>
+            <w:r>
+              <w:rPr>
+                <w:rFonts w:ascii="Times New Roman" w:hAnsi="Times New Roman" w:eastAsia="Times New Roman"/>
+                <w:b w:val="0"/>
+                <w:i w:val="0"/>
+                <w:sz w:val="18"/>
+              </w:rPr>
+              <w:t>66.7%</w:t>
+            </w:r>
+          </w:p>
+        </w:tc>
+        <w:tc>
+          <w:tcPr>
+            <w:tcW w:w="4309" w:type="dxa"/>
+          </w:tcPr>
+          <w:p>
+            <w:pPr>
+              <w:spacing w:after="0" w:line="240" w:lineRule="auto"/>
+            </w:pPr>
+            <w:r>
+              <w:rPr>
+                <w:rFonts w:ascii="Times New Roman" w:hAnsi="Times New Roman" w:eastAsia="Times New Roman"/>
+                <w:b w:val="0"/>
+                <w:i w:val="0"/>
+                <w:sz w:val="18"/>
+              </w:rPr>
+              <w:t>-40.8%</w:t>
+            </w:r>
+          </w:p>
+        </w:tc>
+        <w:tc>
+          <w:tcPr>
+            <w:tcW w:w="2494" w:type="dxa"/>
+          </w:tcPr>
+          <w:p>
+            <w:pPr>
+              <w:spacing w:after="0" w:line="240" w:lineRule="auto"/>
+            </w:pPr>
+            <w:r>
+              <w:rPr>
+                <w:rFonts w:ascii="Times New Roman" w:hAnsi="Times New Roman" w:eastAsia="Times New Roman"/>
+                <w:b w:val="0"/>
+                <w:i w:val="0"/>
+                <w:sz w:val="18"/>
+              </w:rPr>
+              <w:t>None</w:t>
+            </w:r>
+          </w:p>
+        </w:tc>
+        <w:tc>
+          <w:tcPr>
+            <w:tcW w:w="1571" w:type="dxa"/>
+          </w:tcPr>
+          <w:p>
+            <w:pPr>
+              <w:spacing w:after="0" w:line="240" w:lineRule="auto"/>
+            </w:pPr>
+            <w:r>
+              <w:rPr>
+                <w:rFonts w:ascii="Times New Roman" w:hAnsi="Times New Roman" w:eastAsia="Times New Roman"/>
+                <w:b w:val="0"/>
+                <w:i w:val="0"/>
+                <w:sz w:val="18"/>
+              </w:rPr>
+              <w:t>Supportive</w:t>
+            </w:r>
+          </w:p>
+        </w:tc>
+      </w:tr>
+      <w:tr>
+        <w:tblPrEx>
+          <w:tblBorders>
+            <w:top w:val="single" w:color="auto" w:sz="4" w:space="0"/>
+            <w:left w:val="single" w:color="auto" w:sz="4" w:space="0"/>
+            <w:bottom w:val="single" w:color="auto" w:sz="4" w:space="0"/>
+            <w:right w:val="single" w:color="auto" w:sz="4" w:space="0"/>
+            <w:insideH w:val="single" w:color="auto" w:sz="4" w:space="0"/>
+            <w:insideV w:val="single" w:color="auto" w:sz="4" w:space="0"/>
+          </w:tblBorders>
+          <w:tblCellMar>
+            <w:top w:w="0" w:type="dxa"/>
+            <w:left w:w="108" w:type="dxa"/>
+            <w:bottom w:w="0" w:type="dxa"/>
+            <w:right w:w="108" w:type="dxa"/>
+          </w:tblCellMar>
+        </w:tblPrEx>
+        <w:trPr>
+          <w:jc w:val="center"/>
+        </w:trPr>
+        <w:tc>
+          <w:tcPr>
+            <w:tcW w:w="1587" w:type="dxa"/>
+          </w:tcPr>
+          <w:p>
+            <w:pPr>
+              <w:spacing w:after="0" w:line="240" w:lineRule="auto"/>
+            </w:pPr>
+            <w:r>
+              <w:rPr>
+                <w:rFonts w:ascii="Times New Roman" w:hAnsi="Times New Roman" w:eastAsia="Times New Roman"/>
+                <w:b w:val="0"/>
+                <w:i w:val="0"/>
+                <w:sz w:val="18"/>
+              </w:rPr>
+              <w:t>CUX1</w:t>
+            </w:r>
+          </w:p>
+        </w:tc>
+        <w:tc>
+          <w:tcPr>
+            <w:tcW w:w="1361" w:type="dxa"/>
+          </w:tcPr>
+          <w:p>
+            <w:pPr>
+              <w:spacing w:after="0" w:line="240" w:lineRule="auto"/>
+            </w:pPr>
+            <w:r>
+              <w:rPr>
+                <w:rFonts w:ascii="Times New Roman" w:hAnsi="Times New Roman" w:eastAsia="Times New Roman"/>
+                <w:b w:val="0"/>
+                <w:i w:val="0"/>
+                <w:sz w:val="18"/>
+              </w:rPr>
+              <w:t>A</w:t>
+            </w:r>
+          </w:p>
+        </w:tc>
+        <w:tc>
+          <w:tcPr>
+            <w:tcW w:w="1928" w:type="dxa"/>
+          </w:tcPr>
+          <w:p>
+            <w:pPr>
+              <w:spacing w:after="0" w:line="240" w:lineRule="auto"/>
+            </w:pPr>
+            <w:r>
+              <w:rPr>
+                <w:rFonts w:ascii="Times New Roman" w:hAnsi="Times New Roman" w:eastAsia="Times New Roman"/>
+                <w:b w:val="0"/>
+                <w:i w:val="0"/>
+                <w:sz w:val="18"/>
+              </w:rPr>
+              <w:t>Reduced in lesion tissue</w:t>
+            </w:r>
+          </w:p>
+        </w:tc>
+        <w:tc>
+          <w:tcPr>
+            <w:tcW w:w="1701" w:type="dxa"/>
+          </w:tcPr>
+          <w:p>
+            <w:pPr>
+              <w:spacing w:after="0" w:line="240" w:lineRule="auto"/>
+            </w:pPr>
+            <w:r>
+              <w:rPr>
+                <w:rFonts w:ascii="Times New Roman" w:hAnsi="Times New Roman" w:eastAsia="Times New Roman"/>
+                <w:b w:val="0"/>
+                <w:i w:val="0"/>
+                <w:sz w:val="18"/>
+              </w:rPr>
+              <w:t>Yes</w:t>
+            </w:r>
+          </w:p>
+        </w:tc>
+        <w:tc>
+          <w:tcPr>
+            <w:tcW w:w="1474" w:type="dxa"/>
+          </w:tcPr>
+          <w:p>
+            <w:pPr>
+              <w:spacing w:after="0" w:line="240" w:lineRule="auto"/>
+            </w:pPr>
+            <w:r>
+              <w:rPr>
+                <w:rFonts w:ascii="Times New Roman" w:hAnsi="Times New Roman" w:eastAsia="Times New Roman"/>
+                <w:b w:val="0"/>
+                <w:i w:val="0"/>
+                <w:sz w:val="18"/>
+              </w:rPr>
+              <w:t>Concordant</w:t>
+            </w:r>
+          </w:p>
+        </w:tc>
+        <w:tc>
+          <w:tcPr>
+            <w:tcW w:w="1928" w:type="dxa"/>
+          </w:tcPr>
+          <w:p>
+            <w:pPr>
+              <w:spacing w:after="0" w:line="240" w:lineRule="auto"/>
+            </w:pPr>
+            <w:r>
+              <w:rPr>
+                <w:rFonts w:ascii="Times New Roman" w:hAnsi="Times New Roman" w:eastAsia="Times New Roman"/>
+                <w:b w:val="0"/>
+                <w:i w:val="0"/>
+                <w:sz w:val="18"/>
+              </w:rPr>
+              <w:t>66.7%</w:t>
+            </w:r>
+          </w:p>
+        </w:tc>
+        <w:tc>
+          <w:tcPr>
+            <w:tcW w:w="4309" w:type="dxa"/>
+          </w:tcPr>
+          <w:p>
+            <w:pPr>
+              <w:spacing w:after="0" w:line="240" w:lineRule="auto"/>
+            </w:pPr>
+            <w:r>
+              <w:rPr>
+                <w:rFonts w:ascii="Times New Roman" w:hAnsi="Times New Roman" w:eastAsia="Times New Roman"/>
+                <w:b w:val="0"/>
+                <w:i w:val="0"/>
+                <w:sz w:val="18"/>
+              </w:rPr>
+              <w:t>-60.8% (most network dependent)</w:t>
+            </w:r>
+          </w:p>
+        </w:tc>
+        <w:tc>
+          <w:tcPr>
+            <w:tcW w:w="2494" w:type="dxa"/>
+          </w:tcPr>
+          <w:p>
+            <w:pPr>
+              <w:spacing w:after="0" w:line="240" w:lineRule="auto"/>
+            </w:pPr>
+            <w:r>
+              <w:rPr>
+                <w:rFonts w:ascii="Times New Roman" w:hAnsi="Times New Roman" w:eastAsia="Times New Roman"/>
+                <w:b w:val="0"/>
+                <w:i w:val="0"/>
+                <w:sz w:val="18"/>
+              </w:rPr>
+              <w:t>None</w:t>
+            </w:r>
+          </w:p>
+        </w:tc>
+        <w:tc>
+          <w:tcPr>
+            <w:tcW w:w="1571" w:type="dxa"/>
+          </w:tcPr>
+          <w:p>
+            <w:pPr>
+              <w:spacing w:after="0" w:line="240" w:lineRule="auto"/>
+            </w:pPr>
+            <w:r>
+              <w:rPr>
+                <w:rFonts w:ascii="Times New Roman" w:hAnsi="Times New Roman" w:eastAsia="Times New Roman"/>
+                <w:b w:val="0"/>
+                <w:i w:val="0"/>
+                <w:sz w:val="18"/>
+              </w:rPr>
+              <w:t>Supportive, network dependent</w:t>
             </w:r>
           </w:p>
         </w:tc>
       </w:tr>
     </w:tbl>
-    <w:p/>
+    <w:p>
+      <w:pPr>
+        <w:spacing w:before="120" w:after="120" w:line="276" w:lineRule="auto"/>
+        <w:rPr>
+          <w:rFonts w:ascii="Times New Roman" w:hAnsi="Times New Roman" w:eastAsia="Times New Roman"/>
+          <w:b w:val="0"/>
+          <w:i/>
+          <w:sz w:val="16"/>
+        </w:rPr>
+      </w:pPr>
+      <w:r>
+        <w:rPr>
+          <w:rFonts w:ascii="Times New Roman" w:hAnsi="Times New Roman" w:eastAsia="Times New Roman"/>
+          <w:b w:val="0"/>
+          <w:i/>
+          <w:sz w:val="16"/>
+        </w:rPr>
+        <w:t xml:space="preserve">Literature evidence class: A, direct human FCD or FCD II tissue evidence; B, epilepsy-related functional evidence together with central nervous system or glial support. Axis direction is the direction of the regulon activity difference between lesion tissue and internal control. Expression-scale stable means that candidate entry is preserved when the screening-scale expression statistic R is replaced by the linear-scale statistic L. Donor concordance means that the two donor pseudobulk contrasts agree in sign. Threshold retention is the fraction of the 81 entry-threshold combinations in which the candidate retains membership, with the direction requirement always enforced. Network-edge change is the percentage change in mean simulated displacement when links are restricted to motif-supported edges with the embedding held fixed. Regulon-target enrichment summarises the GO and KEGG results of the regulon-target query. The regulon activity difference, regulon FDR, target-gene count, differentially expressed gene overlap, expression statistic R and in silico perturbation metrics for the seven candidates </w:t>
+      </w:r>
+      <w:r>
+        <w:rPr>
+          <w:rFonts w:hint="eastAsia" w:ascii="Times New Roman" w:hAnsi="Times New Roman" w:eastAsia="Times New Roman"/>
+          <w:b w:val="0"/>
+          <w:i/>
+          <w:sz w:val="16"/>
+        </w:rPr>
+        <w:t>are reported in the Results and in Additional file 2, Tables ST02, ST03, ST05 and ST08.</w:t>
+      </w:r>
+      <w:bookmarkStart w:id="0" w:name="_GoBack"/>
+      <w:bookmarkEnd w:id="0"/>
+    </w:p>
     <w:sectPr>
-      <w:pgSz w:w="12240" w:h="15840"/>
-      <w:pgMar w:top="1440" w:right="1800" w:bottom="1440" w:left="1800" w:header="720" w:footer="720" w:gutter="0"/>
+      <w:pgSz w:w="15840" w:h="12240" w:orient="landscape"/>
+      <w:pgMar w:top="850" w:right="850" w:bottom="850" w:left="850" w:header="720" w:footer="720" w:gutter="0"/>
       <w:cols w:space="720" w:num="1"/>
       <w:docGrid w:linePitch="360" w:charSpace="0"/>
     </w:sectPr>
@@ -1455,20 +1872,20 @@
     <w:lsdException w:uiPriority="99" w:name="endnote reference"/>
     <w:lsdException w:uiPriority="99" w:name="endnote text"/>
     <w:lsdException w:uiPriority="99" w:name="table of authorities"/>
-    <w:lsdException w:qFormat="1" w:uiPriority="99" w:semiHidden="0" w:name="macro"/>
+    <w:lsdException w:uiPriority="99" w:semiHidden="0" w:name="macro"/>
     <w:lsdException w:uiPriority="99" w:name="toa heading"/>
     <w:lsdException w:qFormat="1" w:uiPriority="99" w:semiHidden="0" w:name="List"/>
     <w:lsdException w:qFormat="1" w:uiPriority="99" w:semiHidden="0" w:name="List Bullet"/>
     <w:lsdException w:qFormat="1" w:uiPriority="99" w:semiHidden="0" w:name="List Number"/>
     <w:lsdException w:qFormat="1" w:uiPriority="99" w:semiHidden="0" w:name="List 2"/>
-    <w:lsdException w:qFormat="1" w:uiPriority="99" w:semiHidden="0" w:name="List 3"/>
+    <w:lsdException w:uiPriority="99" w:semiHidden="0" w:name="List 3"/>
     <w:lsdException w:uiPriority="99" w:name="List 4"/>
     <w:lsdException w:uiPriority="99" w:name="List 5"/>
     <w:lsdException w:qFormat="1" w:uiPriority="99" w:semiHidden="0" w:name="List Bullet 2"/>
     <w:lsdException w:qFormat="1" w:uiPriority="99" w:semiHidden="0" w:name="List Bullet 3"/>
     <w:lsdException w:uiPriority="99" w:name="List Bullet 4"/>
     <w:lsdException w:uiPriority="99" w:name="List Bullet 5"/>
-    <w:lsdException w:qFormat="1" w:uiPriority="99" w:semiHidden="0" w:name="List Number 2"/>
+    <w:lsdException w:uiPriority="99" w:semiHidden="0" w:name="List Number 2"/>
     <w:lsdException w:qFormat="1" w:uiPriority="99" w:semiHidden="0" w:name="List Number 3"/>
     <w:lsdException w:uiPriority="99" w:name="List Number 4"/>
     <w:lsdException w:uiPriority="99" w:name="List Number 5"/>
@@ -1480,7 +1897,7 @@
     <w:lsdException w:uiPriority="99" w:name="Body Text Indent"/>
     <w:lsdException w:qFormat="1" w:uiPriority="99" w:semiHidden="0" w:name="List Continue"/>
     <w:lsdException w:qFormat="1" w:uiPriority="99" w:semiHidden="0" w:name="List Continue 2"/>
-    <w:lsdException w:qFormat="1" w:uiPriority="99" w:semiHidden="0" w:name="List Continue 3"/>
+    <w:lsdException w:uiPriority="99" w:semiHidden="0" w:name="List Continue 3"/>
     <w:lsdException w:uiPriority="99" w:name="List Continue 4"/>
     <w:lsdException w:uiPriority="99" w:name="List Continue 5"/>
     <w:lsdException w:uiPriority="99" w:name="Message Header"/>
@@ -1558,110 +1975,110 @@
     <w:lsdException w:uiPriority="99" w:name="Table Web 2"/>
     <w:lsdException w:uiPriority="99" w:name="Table Web 3"/>
     <w:lsdException w:uiPriority="99" w:name="Balloon Text"/>
-    <w:lsdException w:qFormat="1" w:unhideWhenUsed="0" w:uiPriority="59" w:semiHidden="0" w:name="Table Grid"/>
+    <w:lsdException w:unhideWhenUsed="0" w:uiPriority="59" w:semiHidden="0" w:name="Table Grid"/>
     <w:lsdException w:uiPriority="99" w:name="Table Theme"/>
     <w:lsdException w:qFormat="1" w:unhideWhenUsed="0" w:uiPriority="1" w:semiHidden="0" w:name="No Spacing"/>
-    <w:lsdException w:qFormat="1" w:unhideWhenUsed="0" w:uiPriority="60" w:semiHidden="0" w:name="Light Shading"/>
-    <w:lsdException w:qFormat="1" w:unhideWhenUsed="0" w:uiPriority="61" w:semiHidden="0" w:name="Light List"/>
-    <w:lsdException w:qFormat="1" w:unhideWhenUsed="0" w:uiPriority="62" w:semiHidden="0" w:name="Light Grid"/>
+    <w:lsdException w:unhideWhenUsed="0" w:uiPriority="60" w:semiHidden="0" w:name="Light Shading"/>
+    <w:lsdException w:unhideWhenUsed="0" w:uiPriority="61" w:semiHidden="0" w:name="Light List"/>
+    <w:lsdException w:unhideWhenUsed="0" w:uiPriority="62" w:semiHidden="0" w:name="Light Grid"/>
     <w:lsdException w:unhideWhenUsed="0" w:uiPriority="63" w:semiHidden="0" w:name="Medium Shading 1"/>
     <w:lsdException w:unhideWhenUsed="0" w:uiPriority="64" w:semiHidden="0" w:name="Medium Shading 2"/>
-    <w:lsdException w:qFormat="1" w:unhideWhenUsed="0" w:uiPriority="65" w:semiHidden="0" w:name="Medium List 1"/>
-    <w:lsdException w:qFormat="1" w:unhideWhenUsed="0" w:uiPriority="66" w:semiHidden="0" w:name="Medium List 2"/>
-    <w:lsdException w:qFormat="1" w:unhideWhenUsed="0" w:uiPriority="67" w:semiHidden="0" w:name="Medium Grid 1"/>
-    <w:lsdException w:qFormat="1" w:unhideWhenUsed="0" w:uiPriority="68" w:semiHidden="0" w:name="Medium Grid 2"/>
-    <w:lsdException w:qFormat="1" w:unhideWhenUsed="0" w:uiPriority="69" w:semiHidden="0" w:name="Medium Grid 3"/>
-    <w:lsdException w:qFormat="1" w:unhideWhenUsed="0" w:uiPriority="70" w:semiHidden="0" w:name="Dark List"/>
-    <w:lsdException w:qFormat="1" w:unhideWhenUsed="0" w:uiPriority="71" w:semiHidden="0" w:name="Colorful Shading"/>
-    <w:lsdException w:qFormat="1" w:unhideWhenUsed="0" w:uiPriority="72" w:semiHidden="0" w:name="Colorful List"/>
-    <w:lsdException w:qFormat="1" w:unhideWhenUsed="0" w:uiPriority="73" w:semiHidden="0" w:name="Colorful Grid"/>
-    <w:lsdException w:qFormat="1" w:unhideWhenUsed="0" w:uiPriority="60" w:semiHidden="0" w:name="Light Shading Accent 1"/>
-    <w:lsdException w:qFormat="1" w:unhideWhenUsed="0" w:uiPriority="61" w:semiHidden="0" w:name="Light List Accent 1"/>
-    <w:lsdException w:qFormat="1" w:unhideWhenUsed="0" w:uiPriority="62" w:semiHidden="0" w:name="Light Grid Accent 1"/>
-    <w:lsdException w:qFormat="1" w:unhideWhenUsed="0" w:uiPriority="63" w:semiHidden="0" w:name="Medium Shading 1 Accent 1"/>
+    <w:lsdException w:unhideWhenUsed="0" w:uiPriority="65" w:semiHidden="0" w:name="Medium List 1"/>
+    <w:lsdException w:unhideWhenUsed="0" w:uiPriority="66" w:semiHidden="0" w:name="Medium List 2"/>
+    <w:lsdException w:unhideWhenUsed="0" w:uiPriority="67" w:semiHidden="0" w:name="Medium Grid 1"/>
+    <w:lsdException w:unhideWhenUsed="0" w:uiPriority="68" w:semiHidden="0" w:name="Medium Grid 2"/>
+    <w:lsdException w:unhideWhenUsed="0" w:uiPriority="69" w:semiHidden="0" w:name="Medium Grid 3"/>
+    <w:lsdException w:unhideWhenUsed="0" w:uiPriority="70" w:semiHidden="0" w:name="Dark List"/>
+    <w:lsdException w:unhideWhenUsed="0" w:uiPriority="71" w:semiHidden="0" w:name="Colorful Shading"/>
+    <w:lsdException w:unhideWhenUsed="0" w:uiPriority="72" w:semiHidden="0" w:name="Colorful List"/>
+    <w:lsdException w:unhideWhenUsed="0" w:uiPriority="73" w:semiHidden="0" w:name="Colorful Grid"/>
+    <w:lsdException w:unhideWhenUsed="0" w:uiPriority="60" w:semiHidden="0" w:name="Light Shading Accent 1"/>
+    <w:lsdException w:unhideWhenUsed="0" w:uiPriority="61" w:semiHidden="0" w:name="Light List Accent 1"/>
+    <w:lsdException w:unhideWhenUsed="0" w:uiPriority="62" w:semiHidden="0" w:name="Light Grid Accent 1"/>
+    <w:lsdException w:unhideWhenUsed="0" w:uiPriority="63" w:semiHidden="0" w:name="Medium Shading 1 Accent 1"/>
     <w:lsdException w:unhideWhenUsed="0" w:uiPriority="64" w:semiHidden="0" w:name="Medium Shading 2 Accent 1"/>
-    <w:lsdException w:qFormat="1" w:unhideWhenUsed="0" w:uiPriority="65" w:semiHidden="0" w:name="Medium List 1 Accent 1"/>
+    <w:lsdException w:unhideWhenUsed="0" w:uiPriority="65" w:semiHidden="0" w:name="Medium List 1 Accent 1"/>
     <w:lsdException w:qFormat="1" w:unhideWhenUsed="0" w:uiPriority="34" w:semiHidden="0" w:name="List Paragraph"/>
     <w:lsdException w:qFormat="1" w:unhideWhenUsed="0" w:uiPriority="29" w:semiHidden="0" w:name="Quote"/>
     <w:lsdException w:qFormat="1" w:unhideWhenUsed="0" w:uiPriority="30" w:semiHidden="0" w:name="Intense Quote"/>
     <w:lsdException w:unhideWhenUsed="0" w:uiPriority="66" w:semiHidden="0" w:name="Medium List 2 Accent 1"/>
     <w:lsdException w:unhideWhenUsed="0" w:uiPriority="67" w:semiHidden="0" w:name="Medium Grid 1 Accent 1"/>
-    <w:lsdException w:qFormat="1" w:unhideWhenUsed="0" w:uiPriority="68" w:semiHidden="0" w:name="Medium Grid 2 Accent 1"/>
-    <w:lsdException w:qFormat="1" w:unhideWhenUsed="0" w:uiPriority="69" w:semiHidden="0" w:name="Medium Grid 3 Accent 1"/>
-    <w:lsdException w:qFormat="1" w:unhideWhenUsed="0" w:uiPriority="70" w:semiHidden="0" w:name="Dark List Accent 1"/>
-    <w:lsdException w:qFormat="1" w:unhideWhenUsed="0" w:uiPriority="71" w:semiHidden="0" w:name="Colorful Shading Accent 1"/>
-    <w:lsdException w:qFormat="1" w:unhideWhenUsed="0" w:uiPriority="72" w:semiHidden="0" w:name="Colorful List Accent 1"/>
-    <w:lsdException w:qFormat="1" w:unhideWhenUsed="0" w:uiPriority="73" w:semiHidden="0" w:name="Colorful Grid Accent 1"/>
-    <w:lsdException w:qFormat="1" w:unhideWhenUsed="0" w:uiPriority="60" w:semiHidden="0" w:name="Light Shading Accent 2"/>
-    <w:lsdException w:qFormat="1" w:unhideWhenUsed="0" w:uiPriority="61" w:semiHidden="0" w:name="Light List Accent 2"/>
+    <w:lsdException w:unhideWhenUsed="0" w:uiPriority="68" w:semiHidden="0" w:name="Medium Grid 2 Accent 1"/>
+    <w:lsdException w:unhideWhenUsed="0" w:uiPriority="69" w:semiHidden="0" w:name="Medium Grid 3 Accent 1"/>
+    <w:lsdException w:unhideWhenUsed="0" w:uiPriority="70" w:semiHidden="0" w:name="Dark List Accent 1"/>
+    <w:lsdException w:unhideWhenUsed="0" w:uiPriority="71" w:semiHidden="0" w:name="Colorful Shading Accent 1"/>
+    <w:lsdException w:unhideWhenUsed="0" w:uiPriority="72" w:semiHidden="0" w:name="Colorful List Accent 1"/>
+    <w:lsdException w:unhideWhenUsed="0" w:uiPriority="73" w:semiHidden="0" w:name="Colorful Grid Accent 1"/>
+    <w:lsdException w:unhideWhenUsed="0" w:uiPriority="60" w:semiHidden="0" w:name="Light Shading Accent 2"/>
+    <w:lsdException w:unhideWhenUsed="0" w:uiPriority="61" w:semiHidden="0" w:name="Light List Accent 2"/>
     <w:lsdException w:unhideWhenUsed="0" w:uiPriority="62" w:semiHidden="0" w:name="Light Grid Accent 2"/>
     <w:lsdException w:unhideWhenUsed="0" w:uiPriority="63" w:semiHidden="0" w:name="Medium Shading 1 Accent 2"/>
     <w:lsdException w:unhideWhenUsed="0" w:uiPriority="64" w:semiHidden="0" w:name="Medium Shading 2 Accent 2"/>
-    <w:lsdException w:qFormat="1" w:unhideWhenUsed="0" w:uiPriority="65" w:semiHidden="0" w:name="Medium List 1 Accent 2"/>
-    <w:lsdException w:qFormat="1" w:unhideWhenUsed="0" w:uiPriority="66" w:semiHidden="0" w:name="Medium List 2 Accent 2"/>
-    <w:lsdException w:qFormat="1" w:unhideWhenUsed="0" w:uiPriority="67" w:semiHidden="0" w:name="Medium Grid 1 Accent 2"/>
+    <w:lsdException w:unhideWhenUsed="0" w:uiPriority="65" w:semiHidden="0" w:name="Medium List 1 Accent 2"/>
+    <w:lsdException w:unhideWhenUsed="0" w:uiPriority="66" w:semiHidden="0" w:name="Medium List 2 Accent 2"/>
+    <w:lsdException w:unhideWhenUsed="0" w:uiPriority="67" w:semiHidden="0" w:name="Medium Grid 1 Accent 2"/>
     <w:lsdException w:unhideWhenUsed="0" w:uiPriority="68" w:semiHidden="0" w:name="Medium Grid 2 Accent 2"/>
-    <w:lsdException w:qFormat="1" w:unhideWhenUsed="0" w:uiPriority="69" w:semiHidden="0" w:name="Medium Grid 3 Accent 2"/>
-    <w:lsdException w:qFormat="1" w:unhideWhenUsed="0" w:uiPriority="70" w:semiHidden="0" w:name="Dark List Accent 2"/>
-    <w:lsdException w:qFormat="1" w:unhideWhenUsed="0" w:uiPriority="71" w:semiHidden="0" w:name="Colorful Shading Accent 2"/>
-    <w:lsdException w:qFormat="1" w:unhideWhenUsed="0" w:uiPriority="72" w:semiHidden="0" w:name="Colorful List Accent 2"/>
-    <w:lsdException w:qFormat="1" w:unhideWhenUsed="0" w:uiPriority="73" w:semiHidden="0" w:name="Colorful Grid Accent 2"/>
-    <w:lsdException w:qFormat="1" w:unhideWhenUsed="0" w:uiPriority="60" w:semiHidden="0" w:name="Light Shading Accent 3"/>
-    <w:lsdException w:qFormat="1" w:unhideWhenUsed="0" w:uiPriority="61" w:semiHidden="0" w:name="Light List Accent 3"/>
-    <w:lsdException w:qFormat="1" w:unhideWhenUsed="0" w:uiPriority="62" w:semiHidden="0" w:name="Light Grid Accent 3"/>
-    <w:lsdException w:qFormat="1" w:unhideWhenUsed="0" w:uiPriority="63" w:semiHidden="0" w:name="Medium Shading 1 Accent 3"/>
-    <w:lsdException w:qFormat="1" w:unhideWhenUsed="0" w:uiPriority="64" w:semiHidden="0" w:name="Medium Shading 2 Accent 3"/>
-    <w:lsdException w:qFormat="1" w:unhideWhenUsed="0" w:uiPriority="65" w:semiHidden="0" w:name="Medium List 1 Accent 3"/>
+    <w:lsdException w:unhideWhenUsed="0" w:uiPriority="69" w:semiHidden="0" w:name="Medium Grid 3 Accent 2"/>
+    <w:lsdException w:unhideWhenUsed="0" w:uiPriority="70" w:semiHidden="0" w:name="Dark List Accent 2"/>
+    <w:lsdException w:unhideWhenUsed="0" w:uiPriority="71" w:semiHidden="0" w:name="Colorful Shading Accent 2"/>
+    <w:lsdException w:unhideWhenUsed="0" w:uiPriority="72" w:semiHidden="0" w:name="Colorful List Accent 2"/>
+    <w:lsdException w:unhideWhenUsed="0" w:uiPriority="73" w:semiHidden="0" w:name="Colorful Grid Accent 2"/>
+    <w:lsdException w:unhideWhenUsed="0" w:uiPriority="60" w:semiHidden="0" w:name="Light Shading Accent 3"/>
+    <w:lsdException w:unhideWhenUsed="0" w:uiPriority="61" w:semiHidden="0" w:name="Light List Accent 3"/>
+    <w:lsdException w:unhideWhenUsed="0" w:uiPriority="62" w:semiHidden="0" w:name="Light Grid Accent 3"/>
+    <w:lsdException w:unhideWhenUsed="0" w:uiPriority="63" w:semiHidden="0" w:name="Medium Shading 1 Accent 3"/>
+    <w:lsdException w:unhideWhenUsed="0" w:uiPriority="64" w:semiHidden="0" w:name="Medium Shading 2 Accent 3"/>
+    <w:lsdException w:unhideWhenUsed="0" w:uiPriority="65" w:semiHidden="0" w:name="Medium List 1 Accent 3"/>
     <w:lsdException w:unhideWhenUsed="0" w:uiPriority="66" w:semiHidden="0" w:name="Medium List 2 Accent 3"/>
-    <w:lsdException w:qFormat="1" w:unhideWhenUsed="0" w:uiPriority="67" w:semiHidden="0" w:name="Medium Grid 1 Accent 3"/>
-    <w:lsdException w:qFormat="1" w:unhideWhenUsed="0" w:uiPriority="68" w:semiHidden="0" w:name="Medium Grid 2 Accent 3"/>
-    <w:lsdException w:qFormat="1" w:unhideWhenUsed="0" w:uiPriority="69" w:semiHidden="0" w:name="Medium Grid 3 Accent 3"/>
-    <w:lsdException w:qFormat="1" w:unhideWhenUsed="0" w:uiPriority="70" w:semiHidden="0" w:name="Dark List Accent 3"/>
-    <w:lsdException w:qFormat="1" w:unhideWhenUsed="0" w:uiPriority="71" w:semiHidden="0" w:name="Colorful Shading Accent 3"/>
-    <w:lsdException w:qFormat="1" w:unhideWhenUsed="0" w:uiPriority="72" w:semiHidden="0" w:name="Colorful List Accent 3"/>
-    <w:lsdException w:qFormat="1" w:unhideWhenUsed="0" w:uiPriority="73" w:semiHidden="0" w:name="Colorful Grid Accent 3"/>
-    <w:lsdException w:qFormat="1" w:unhideWhenUsed="0" w:uiPriority="60" w:semiHidden="0" w:name="Light Shading Accent 4"/>
-    <w:lsdException w:qFormat="1" w:unhideWhenUsed="0" w:uiPriority="61" w:semiHidden="0" w:name="Light List Accent 4"/>
-    <w:lsdException w:qFormat="1" w:unhideWhenUsed="0" w:uiPriority="62" w:semiHidden="0" w:name="Light Grid Accent 4"/>
-    <w:lsdException w:qFormat="1" w:unhideWhenUsed="0" w:uiPriority="63" w:semiHidden="0" w:name="Medium Shading 1 Accent 4"/>
+    <w:lsdException w:unhideWhenUsed="0" w:uiPriority="67" w:semiHidden="0" w:name="Medium Grid 1 Accent 3"/>
+    <w:lsdException w:unhideWhenUsed="0" w:uiPriority="68" w:semiHidden="0" w:name="Medium Grid 2 Accent 3"/>
+    <w:lsdException w:unhideWhenUsed="0" w:uiPriority="69" w:semiHidden="0" w:name="Medium Grid 3 Accent 3"/>
+    <w:lsdException w:unhideWhenUsed="0" w:uiPriority="70" w:semiHidden="0" w:name="Dark List Accent 3"/>
+    <w:lsdException w:unhideWhenUsed="0" w:uiPriority="71" w:semiHidden="0" w:name="Colorful Shading Accent 3"/>
+    <w:lsdException w:unhideWhenUsed="0" w:uiPriority="72" w:semiHidden="0" w:name="Colorful List Accent 3"/>
+    <w:lsdException w:unhideWhenUsed="0" w:uiPriority="73" w:semiHidden="0" w:name="Colorful Grid Accent 3"/>
+    <w:lsdException w:unhideWhenUsed="0" w:uiPriority="60" w:semiHidden="0" w:name="Light Shading Accent 4"/>
+    <w:lsdException w:unhideWhenUsed="0" w:uiPriority="61" w:semiHidden="0" w:name="Light List Accent 4"/>
+    <w:lsdException w:unhideWhenUsed="0" w:uiPriority="62" w:semiHidden="0" w:name="Light Grid Accent 4"/>
+    <w:lsdException w:unhideWhenUsed="0" w:uiPriority="63" w:semiHidden="0" w:name="Medium Shading 1 Accent 4"/>
     <w:lsdException w:unhideWhenUsed="0" w:uiPriority="64" w:semiHidden="0" w:name="Medium Shading 2 Accent 4"/>
     <w:lsdException w:unhideWhenUsed="0" w:uiPriority="65" w:semiHidden="0" w:name="Medium List 1 Accent 4"/>
     <w:lsdException w:unhideWhenUsed="0" w:uiPriority="66" w:semiHidden="0" w:name="Medium List 2 Accent 4"/>
     <w:lsdException w:unhideWhenUsed="0" w:uiPriority="67" w:semiHidden="0" w:name="Medium Grid 1 Accent 4"/>
-    <w:lsdException w:qFormat="1" w:unhideWhenUsed="0" w:uiPriority="68" w:semiHidden="0" w:name="Medium Grid 2 Accent 4"/>
-    <w:lsdException w:qFormat="1" w:unhideWhenUsed="0" w:uiPriority="69" w:semiHidden="0" w:name="Medium Grid 3 Accent 4"/>
-    <w:lsdException w:qFormat="1" w:unhideWhenUsed="0" w:uiPriority="70" w:semiHidden="0" w:name="Dark List Accent 4"/>
-    <w:lsdException w:qFormat="1" w:unhideWhenUsed="0" w:uiPriority="71" w:semiHidden="0" w:name="Colorful Shading Accent 4"/>
-    <w:lsdException w:qFormat="1" w:unhideWhenUsed="0" w:uiPriority="72" w:semiHidden="0" w:name="Colorful List Accent 4"/>
-    <w:lsdException w:qFormat="1" w:unhideWhenUsed="0" w:uiPriority="73" w:semiHidden="0" w:name="Colorful Grid Accent 4"/>
-    <w:lsdException w:qFormat="1" w:unhideWhenUsed="0" w:uiPriority="60" w:semiHidden="0" w:name="Light Shading Accent 5"/>
-    <w:lsdException w:qFormat="1" w:unhideWhenUsed="0" w:uiPriority="61" w:semiHidden="0" w:name="Light List Accent 5"/>
-    <w:lsdException w:qFormat="1" w:unhideWhenUsed="0" w:uiPriority="62" w:semiHidden="0" w:name="Light Grid Accent 5"/>
+    <w:lsdException w:unhideWhenUsed="0" w:uiPriority="68" w:semiHidden="0" w:name="Medium Grid 2 Accent 4"/>
+    <w:lsdException w:unhideWhenUsed="0" w:uiPriority="69" w:semiHidden="0" w:name="Medium Grid 3 Accent 4"/>
+    <w:lsdException w:unhideWhenUsed="0" w:uiPriority="70" w:semiHidden="0" w:name="Dark List Accent 4"/>
+    <w:lsdException w:unhideWhenUsed="0" w:uiPriority="71" w:semiHidden="0" w:name="Colorful Shading Accent 4"/>
+    <w:lsdException w:unhideWhenUsed="0" w:uiPriority="72" w:semiHidden="0" w:name="Colorful List Accent 4"/>
+    <w:lsdException w:unhideWhenUsed="0" w:uiPriority="73" w:semiHidden="0" w:name="Colorful Grid Accent 4"/>
+    <w:lsdException w:unhideWhenUsed="0" w:uiPriority="60" w:semiHidden="0" w:name="Light Shading Accent 5"/>
+    <w:lsdException w:unhideWhenUsed="0" w:uiPriority="61" w:semiHidden="0" w:name="Light List Accent 5"/>
+    <w:lsdException w:unhideWhenUsed="0" w:uiPriority="62" w:semiHidden="0" w:name="Light Grid Accent 5"/>
     <w:lsdException w:unhideWhenUsed="0" w:uiPriority="63" w:semiHidden="0" w:name="Medium Shading 1 Accent 5"/>
     <w:lsdException w:unhideWhenUsed="0" w:uiPriority="64" w:semiHidden="0" w:name="Medium Shading 2 Accent 5"/>
-    <w:lsdException w:qFormat="1" w:unhideWhenUsed="0" w:uiPriority="65" w:semiHidden="0" w:name="Medium List 1 Accent 5"/>
-    <w:lsdException w:qFormat="1" w:unhideWhenUsed="0" w:uiPriority="66" w:semiHidden="0" w:name="Medium List 2 Accent 5"/>
-    <w:lsdException w:qFormat="1" w:unhideWhenUsed="0" w:uiPriority="67" w:semiHidden="0" w:name="Medium Grid 1 Accent 5"/>
-    <w:lsdException w:qFormat="1" w:unhideWhenUsed="0" w:uiPriority="68" w:semiHidden="0" w:name="Medium Grid 2 Accent 5"/>
+    <w:lsdException w:unhideWhenUsed="0" w:uiPriority="65" w:semiHidden="0" w:name="Medium List 1 Accent 5"/>
+    <w:lsdException w:unhideWhenUsed="0" w:uiPriority="66" w:semiHidden="0" w:name="Medium List 2 Accent 5"/>
+    <w:lsdException w:unhideWhenUsed="0" w:uiPriority="67" w:semiHidden="0" w:name="Medium Grid 1 Accent 5"/>
+    <w:lsdException w:unhideWhenUsed="0" w:uiPriority="68" w:semiHidden="0" w:name="Medium Grid 2 Accent 5"/>
     <w:lsdException w:qFormat="1" w:unhideWhenUsed="0" w:uiPriority="69" w:semiHidden="0" w:name="Medium Grid 3 Accent 5"/>
-    <w:lsdException w:qFormat="1" w:unhideWhenUsed="0" w:uiPriority="70" w:semiHidden="0" w:name="Dark List Accent 5"/>
-    <w:lsdException w:qFormat="1" w:unhideWhenUsed="0" w:uiPriority="71" w:semiHidden="0" w:name="Colorful Shading Accent 5"/>
-    <w:lsdException w:qFormat="1" w:unhideWhenUsed="0" w:uiPriority="72" w:semiHidden="0" w:name="Colorful List Accent 5"/>
-    <w:lsdException w:qFormat="1" w:unhideWhenUsed="0" w:uiPriority="73" w:semiHidden="0" w:name="Colorful Grid Accent 5"/>
-    <w:lsdException w:qFormat="1" w:unhideWhenUsed="0" w:uiPriority="60" w:semiHidden="0" w:name="Light Shading Accent 6"/>
-    <w:lsdException w:qFormat="1" w:unhideWhenUsed="0" w:uiPriority="61" w:semiHidden="0" w:name="Light List Accent 6"/>
-    <w:lsdException w:qFormat="1" w:unhideWhenUsed="0" w:uiPriority="62" w:semiHidden="0" w:name="Light Grid Accent 6"/>
-    <w:lsdException w:qFormat="1" w:unhideWhenUsed="0" w:uiPriority="63" w:semiHidden="0" w:name="Medium Shading 1 Accent 6"/>
-    <w:lsdException w:qFormat="1" w:unhideWhenUsed="0" w:uiPriority="64" w:semiHidden="0" w:name="Medium Shading 2 Accent 6"/>
+    <w:lsdException w:unhideWhenUsed="0" w:uiPriority="70" w:semiHidden="0" w:name="Dark List Accent 5"/>
+    <w:lsdException w:unhideWhenUsed="0" w:uiPriority="71" w:semiHidden="0" w:name="Colorful Shading Accent 5"/>
+    <w:lsdException w:unhideWhenUsed="0" w:uiPriority="72" w:semiHidden="0" w:name="Colorful List Accent 5"/>
+    <w:lsdException w:unhideWhenUsed="0" w:uiPriority="73" w:semiHidden="0" w:name="Colorful Grid Accent 5"/>
+    <w:lsdException w:unhideWhenUsed="0" w:uiPriority="60" w:semiHidden="0" w:name="Light Shading Accent 6"/>
+    <w:lsdException w:unhideWhenUsed="0" w:uiPriority="61" w:semiHidden="0" w:name="Light List Accent 6"/>
+    <w:lsdException w:unhideWhenUsed="0" w:uiPriority="62" w:semiHidden="0" w:name="Light Grid Accent 6"/>
+    <w:lsdException w:unhideWhenUsed="0" w:uiPriority="63" w:semiHidden="0" w:name="Medium Shading 1 Accent 6"/>
+    <w:lsdException w:unhideWhenUsed="0" w:uiPriority="64" w:semiHidden="0" w:name="Medium Shading 2 Accent 6"/>
     <w:lsdException w:unhideWhenUsed="0" w:uiPriority="65" w:semiHidden="0" w:name="Medium List 1 Accent 6"/>
-    <w:lsdException w:qFormat="1" w:unhideWhenUsed="0" w:uiPriority="66" w:semiHidden="0" w:name="Medium List 2 Accent 6"/>
-    <w:lsdException w:qFormat="1" w:unhideWhenUsed="0" w:uiPriority="67" w:semiHidden="0" w:name="Medium Grid 1 Accent 6"/>
-    <w:lsdException w:qFormat="1" w:unhideWhenUsed="0" w:uiPriority="68" w:semiHidden="0" w:name="Medium Grid 2 Accent 6"/>
-    <w:lsdException w:qFormat="1" w:unhideWhenUsed="0" w:uiPriority="69" w:semiHidden="0" w:name="Medium Grid 3 Accent 6"/>
-    <w:lsdException w:qFormat="1" w:unhideWhenUsed="0" w:uiPriority="70" w:semiHidden="0" w:name="Dark List Accent 6"/>
-    <w:lsdException w:qFormat="1" w:unhideWhenUsed="0" w:uiPriority="71" w:semiHidden="0" w:name="Colorful Shading Accent 6"/>
-    <w:lsdException w:qFormat="1" w:unhideWhenUsed="0" w:uiPriority="72" w:semiHidden="0" w:name="Colorful List Accent 6"/>
-    <w:lsdException w:qFormat="1" w:unhideWhenUsed="0" w:uiPriority="73" w:semiHidden="0" w:name="Colorful Grid Accent 6"/>
+    <w:lsdException w:unhideWhenUsed="0" w:uiPriority="66" w:semiHidden="0" w:name="Medium List 2 Accent 6"/>
+    <w:lsdException w:unhideWhenUsed="0" w:uiPriority="67" w:semiHidden="0" w:name="Medium Grid 1 Accent 6"/>
+    <w:lsdException w:unhideWhenUsed="0" w:uiPriority="68" w:semiHidden="0" w:name="Medium Grid 2 Accent 6"/>
+    <w:lsdException w:unhideWhenUsed="0" w:uiPriority="69" w:semiHidden="0" w:name="Medium Grid 3 Accent 6"/>
+    <w:lsdException w:unhideWhenUsed="0" w:uiPriority="70" w:semiHidden="0" w:name="Dark List Accent 6"/>
+    <w:lsdException w:unhideWhenUsed="0" w:uiPriority="71" w:semiHidden="0" w:name="Colorful Shading Accent 6"/>
+    <w:lsdException w:unhideWhenUsed="0" w:uiPriority="72" w:semiHidden="0" w:name="Colorful List Accent 6"/>
+    <w:lsdException w:unhideWhenUsed="0" w:uiPriority="73" w:semiHidden="0" w:name="Colorful Grid Accent 6"/>
   </w:latentStyles>
   <w:style w:type="paragraph" w:default="1" w:styleId="1">
     <w:name w:val="Normal"/>
@@ -1671,8 +2088,8 @@
       <w:spacing w:after="200" w:line="276" w:lineRule="auto"/>
     </w:pPr>
     <w:rPr>
-      <w:rFonts w:asciiTheme="minorHAnsi" w:hAnsiTheme="minorHAnsi" w:eastAsiaTheme="minorEastAsia" w:cstheme="minorBidi"/>
-      <w:sz w:val="22"/>
+      <w:rFonts w:ascii="Times New Roman" w:hAnsi="Times New Roman" w:eastAsia="Times New Roman" w:cstheme="minorBidi"/>
+      <w:sz w:val="18"/>
       <w:szCs w:val="22"/>
       <w:lang w:val="en-US" w:eastAsia="en-US" w:bidi="ar-SA"/>
     </w:rPr>
@@ -1939,7 +2356,6 @@
     <w:name w:val="macro"/>
     <w:link w:val="147"/>
     <w:unhideWhenUsed/>
-    <w:qFormat/>
     <w:uiPriority w:val="99"/>
     <w:pPr>
       <w:tabs>
@@ -1964,7 +2380,6 @@
     <w:name w:val="List 3"/>
     <w:basedOn w:val="1"/>
     <w:unhideWhenUsed/>
-    <w:qFormat/>
     <w:uiPriority w:val="99"/>
     <w:pPr>
       <w:ind w:left="1080" w:hanging="360"/>
@@ -1975,7 +2390,6 @@
     <w:name w:val="List Number 2"/>
     <w:basedOn w:val="1"/>
     <w:unhideWhenUsed/>
-    <w:qFormat/>
     <w:uiPriority w:val="99"/>
     <w:pPr>
       <w:numPr>
@@ -2218,7 +2632,6 @@
     <w:name w:val="List Continue 3"/>
     <w:basedOn w:val="1"/>
     <w:unhideWhenUsed/>
-    <w:qFormat/>
     <w:uiPriority w:val="99"/>
     <w:pPr>
       <w:spacing w:after="120"/>
@@ -2252,7 +2665,6 @@
   <w:style w:type="table" w:styleId="33">
     <w:name w:val="Table Grid"/>
     <w:basedOn w:val="32"/>
-    <w:qFormat/>
     <w:uiPriority w:val="59"/>
     <w:pPr>
       <w:spacing w:after="0" w:line="240" w:lineRule="auto"/>
@@ -2277,7 +2689,6 @@
   <w:style w:type="table" w:styleId="34">
     <w:name w:val="Light Shading"/>
     <w:basedOn w:val="32"/>
-    <w:qFormat/>
     <w:uiPriority w:val="60"/>
     <w:pPr>
       <w:spacing w:after="0" w:line="240" w:lineRule="auto"/>
@@ -2377,7 +2788,6 @@
   <w:style w:type="table" w:styleId="35">
     <w:name w:val="Light Shading Accent 1"/>
     <w:basedOn w:val="32"/>
-    <w:qFormat/>
     <w:uiPriority w:val="60"/>
     <w:pPr>
       <w:spacing w:after="0" w:line="240" w:lineRule="auto"/>
@@ -2477,7 +2887,6 @@
   <w:style w:type="table" w:styleId="36">
     <w:name w:val="Light Shading Accent 2"/>
     <w:basedOn w:val="32"/>
-    <w:qFormat/>
     <w:uiPriority w:val="60"/>
     <w:pPr>
       <w:spacing w:after="0" w:line="240" w:lineRule="auto"/>
@@ -2577,7 +2986,6 @@
   <w:style w:type="table" w:styleId="37">
     <w:name w:val="Light Shading Accent 3"/>
     <w:basedOn w:val="32"/>
-    <w:qFormat/>
     <w:uiPriority w:val="60"/>
     <w:pPr>
       <w:spacing w:after="0" w:line="240" w:lineRule="auto"/>
@@ -2677,7 +3085,6 @@
   <w:style w:type="table" w:styleId="38">
     <w:name w:val="Light Shading Accent 4"/>
     <w:basedOn w:val="32"/>
-    <w:qFormat/>
     <w:uiPriority w:val="60"/>
     <w:pPr>
       <w:spacing w:after="0" w:line="240" w:lineRule="auto"/>
@@ -2777,7 +3184,6 @@
   <w:style w:type="table" w:styleId="39">
     <w:name w:val="Light Shading Accent 5"/>
     <w:basedOn w:val="32"/>
-    <w:qFormat/>
     <w:uiPriority w:val="60"/>
     <w:pPr>
       <w:spacing w:after="0" w:line="240" w:lineRule="auto"/>
@@ -2877,7 +3283,6 @@
   <w:style w:type="table" w:styleId="40">
     <w:name w:val="Light Shading Accent 6"/>
     <w:basedOn w:val="32"/>
-    <w:qFormat/>
     <w:uiPriority w:val="60"/>
     <w:pPr>
       <w:spacing w:after="0" w:line="240" w:lineRule="auto"/>
@@ -2977,7 +3382,6 @@
   <w:style w:type="table" w:styleId="41">
     <w:name w:val="Light List"/>
     <w:basedOn w:val="32"/>
-    <w:qFormat/>
     <w:uiPriority w:val="61"/>
     <w:pPr>
       <w:spacing w:after="0" w:line="240" w:lineRule="auto"/>
@@ -3071,7 +3475,6 @@
   <w:style w:type="table" w:styleId="42">
     <w:name w:val="Light List Accent 1"/>
     <w:basedOn w:val="32"/>
-    <w:qFormat/>
     <w:uiPriority w:val="61"/>
     <w:pPr>
       <w:spacing w:after="0" w:line="240" w:lineRule="auto"/>
@@ -3165,7 +3568,6 @@
   <w:style w:type="table" w:styleId="43">
     <w:name w:val="Light List Accent 2"/>
     <w:basedOn w:val="32"/>
-    <w:qFormat/>
     <w:uiPriority w:val="61"/>
     <w:pPr>
       <w:spacing w:after="0" w:line="240" w:lineRule="auto"/>
@@ -3259,7 +3661,6 @@
   <w:style w:type="table" w:styleId="44">
     <w:name w:val="Light List Accent 3"/>
     <w:basedOn w:val="32"/>
-    <w:qFormat/>
     <w:uiPriority w:val="61"/>
     <w:pPr>
       <w:spacing w:after="0" w:line="240" w:lineRule="auto"/>
@@ -3353,7 +3754,6 @@
   <w:style w:type="table" w:styleId="45">
     <w:name w:val="Light List Accent 4"/>
     <w:basedOn w:val="32"/>
-    <w:qFormat/>
     <w:uiPriority w:val="61"/>
     <w:pPr>
       <w:spacing w:after="0" w:line="240" w:lineRule="auto"/>
@@ -3447,7 +3847,6 @@
   <w:style w:type="table" w:styleId="46">
     <w:name w:val="Light List Accent 5"/>
     <w:basedOn w:val="32"/>
-    <w:qFormat/>
     <w:uiPriority w:val="61"/>
     <w:pPr>
       <w:spacing w:after="0" w:line="240" w:lineRule="auto"/>
@@ -3541,7 +3940,6 @@
   <w:style w:type="table" w:styleId="47">
     <w:name w:val="Light List Accent 6"/>
     <w:basedOn w:val="32"/>
-    <w:qFormat/>
     <w:uiPriority w:val="61"/>
     <w:pPr>
       <w:spacing w:after="0" w:line="240" w:lineRule="auto"/>
@@ -3635,7 +4033,6 @@
   <w:style w:type="table" w:styleId="48">
     <w:name w:val="Light Grid"/>
     <w:basedOn w:val="32"/>
-    <w:qFormat/>
     <w:uiPriority w:val="62"/>
     <w:pPr>
       <w:spacing w:after="0" w:line="240" w:lineRule="auto"/>
@@ -3762,7 +4159,6 @@
   <w:style w:type="table" w:styleId="49">
     <w:name w:val="Light Grid Accent 1"/>
     <w:basedOn w:val="32"/>
-    <w:qFormat/>
     <w:uiPriority w:val="62"/>
     <w:pPr>
       <w:spacing w:after="0" w:line="240" w:lineRule="auto"/>
@@ -4015,7 +4411,6 @@
   <w:style w:type="table" w:styleId="51">
     <w:name w:val="Light Grid Accent 3"/>
     <w:basedOn w:val="32"/>
-    <w:qFormat/>
     <w:uiPriority w:val="62"/>
     <w:pPr>
       <w:spacing w:after="0" w:line="240" w:lineRule="auto"/>
@@ -4142,7 +4537,6 @@
   <w:style w:type="table" w:styleId="52">
     <w:name w:val="Light Grid Accent 4"/>
     <w:basedOn w:val="32"/>
-    <w:qFormat/>
     <w:uiPriority w:val="62"/>
     <w:pPr>
       <w:spacing w:after="0" w:line="240" w:lineRule="auto"/>
@@ -4269,7 +4663,6 @@
   <w:style w:type="table" w:styleId="53">
     <w:name w:val="Light Grid Accent 5"/>
     <w:basedOn w:val="32"/>
-    <w:qFormat/>
     <w:uiPriority w:val="62"/>
     <w:pPr>
       <w:spacing w:after="0" w:line="240" w:lineRule="auto"/>
@@ -4396,7 +4789,6 @@
   <w:style w:type="table" w:styleId="54">
     <w:name w:val="Light Grid Accent 6"/>
     <w:basedOn w:val="32"/>
-    <w:qFormat/>
     <w:uiPriority w:val="62"/>
     <w:pPr>
       <w:spacing w:after="0" w:line="240" w:lineRule="auto"/>
@@ -4630,7 +5022,6 @@
   <w:style w:type="table" w:styleId="56">
     <w:name w:val="Medium Shading 1 Accent 1"/>
     <w:basedOn w:val="32"/>
-    <w:qFormat/>
     <w:uiPriority w:val="63"/>
     <w:pPr>
       <w:spacing w:after="0" w:line="240" w:lineRule="auto"/>
@@ -4845,7 +5236,6 @@
   <w:style w:type="table" w:styleId="58">
     <w:name w:val="Medium Shading 1 Accent 3"/>
     <w:basedOn w:val="32"/>
-    <w:qFormat/>
     <w:uiPriority w:val="63"/>
     <w:pPr>
       <w:spacing w:after="0" w:line="240" w:lineRule="auto"/>
@@ -4953,7 +5343,6 @@
   <w:style w:type="table" w:styleId="59">
     <w:name w:val="Medium Shading 1 Accent 4"/>
     <w:basedOn w:val="32"/>
-    <w:qFormat/>
     <w:uiPriority w:val="63"/>
     <w:pPr>
       <w:spacing w:after="0" w:line="240" w:lineRule="auto"/>
@@ -5168,7 +5557,6 @@
   <w:style w:type="table" w:styleId="61">
     <w:name w:val="Medium Shading 1 Accent 6"/>
     <w:basedOn w:val="32"/>
-    <w:qFormat/>
     <w:uiPriority w:val="63"/>
     <w:pPr>
       <w:spacing w:after="0" w:line="240" w:lineRule="auto"/>
@@ -5771,7 +6159,6 @@
   <w:style w:type="table" w:styleId="65">
     <w:name w:val="Medium Shading 2 Accent 3"/>
     <w:basedOn w:val="32"/>
-    <w:qFormat/>
     <w:uiPriority w:val="64"/>
     <w:pPr>
       <w:spacing w:after="0" w:line="240" w:lineRule="auto"/>
@@ -6267,7 +6654,6 @@
   <w:style w:type="table" w:styleId="68">
     <w:name w:val="Medium Shading 2 Accent 6"/>
     <w:basedOn w:val="32"/>
-    <w:qFormat/>
     <w:uiPriority w:val="64"/>
     <w:pPr>
       <w:spacing w:after="0" w:line="240" w:lineRule="auto"/>
@@ -6433,7 +6819,6 @@
   <w:style w:type="table" w:styleId="69">
     <w:name w:val="Medium List 1"/>
     <w:basedOn w:val="32"/>
-    <w:qFormat/>
     <w:uiPriority w:val="65"/>
     <w:pPr>
       <w:spacing w:after="0" w:line="240" w:lineRule="auto"/>
@@ -6524,7 +6909,6 @@
   <w:style w:type="table" w:styleId="70">
     <w:name w:val="Medium List 1 Accent 1"/>
     <w:basedOn w:val="32"/>
-    <w:qFormat/>
     <w:uiPriority w:val="65"/>
     <w:pPr>
       <w:spacing w:after="0" w:line="240" w:lineRule="auto"/>
@@ -6615,7 +6999,6 @@
   <w:style w:type="table" w:styleId="71">
     <w:name w:val="Medium List 1 Accent 2"/>
     <w:basedOn w:val="32"/>
-    <w:qFormat/>
     <w:uiPriority w:val="65"/>
     <w:pPr>
       <w:spacing w:after="0" w:line="240" w:lineRule="auto"/>
@@ -6706,7 +7089,6 @@
   <w:style w:type="table" w:styleId="72">
     <w:name w:val="Medium List 1 Accent 3"/>
     <w:basedOn w:val="32"/>
-    <w:qFormat/>
     <w:uiPriority w:val="65"/>
     <w:pPr>
       <w:spacing w:after="0" w:line="240" w:lineRule="auto"/>
@@ -6887,7 +7269,6 @@
   <w:style w:type="table" w:styleId="74">
     <w:name w:val="Medium List 1 Accent 5"/>
     <w:basedOn w:val="32"/>
-    <w:qFormat/>
     <w:uiPriority w:val="65"/>
     <w:pPr>
       <w:spacing w:after="0" w:line="240" w:lineRule="auto"/>
@@ -7068,7 +7449,6 @@
   <w:style w:type="table" w:styleId="76">
     <w:name w:val="Medium List 2"/>
     <w:basedOn w:val="32"/>
-    <w:qFormat/>
     <w:uiPriority w:val="66"/>
     <w:pPr>
       <w:spacing w:after="0" w:line="240" w:lineRule="auto"/>
@@ -7327,7 +7707,6 @@
   <w:style w:type="table" w:styleId="78">
     <w:name w:val="Medium List 2 Accent 2"/>
     <w:basedOn w:val="32"/>
-    <w:qFormat/>
     <w:uiPriority w:val="66"/>
     <w:pPr>
       <w:spacing w:after="0" w:line="240" w:lineRule="auto"/>
@@ -7715,7 +8094,6 @@
   <w:style w:type="table" w:styleId="81">
     <w:name w:val="Medium List 2 Accent 5"/>
     <w:basedOn w:val="32"/>
-    <w:qFormat/>
     <w:uiPriority w:val="66"/>
     <w:pPr>
       <w:spacing w:after="0" w:line="240" w:lineRule="auto"/>
@@ -7845,7 +8223,6 @@
   <w:style w:type="table" w:styleId="82">
     <w:name w:val="Medium List 2 Accent 6"/>
     <w:basedOn w:val="32"/>
-    <w:qFormat/>
     <w:uiPriority w:val="66"/>
     <w:pPr>
       <w:spacing w:after="0" w:line="240" w:lineRule="auto"/>
@@ -7975,7 +8352,6 @@
   <w:style w:type="table" w:styleId="83">
     <w:name w:val="Medium Grid 1"/>
     <w:basedOn w:val="32"/>
-    <w:qFormat/>
     <w:uiPriority w:val="67"/>
     <w:pPr>
       <w:spacing w:after="0" w:line="240" w:lineRule="auto"/>
@@ -8114,7 +8490,6 @@
   <w:style w:type="table" w:styleId="85">
     <w:name w:val="Medium Grid 1 Accent 2"/>
     <w:basedOn w:val="32"/>
-    <w:qFormat/>
     <w:uiPriority w:val="67"/>
     <w:pPr>
       <w:spacing w:after="0" w:line="240" w:lineRule="auto"/>
@@ -8184,7 +8559,6 @@
   <w:style w:type="table" w:styleId="86">
     <w:name w:val="Medium Grid 1 Accent 3"/>
     <w:basedOn w:val="32"/>
-    <w:qFormat/>
     <w:uiPriority w:val="67"/>
     <w:pPr>
       <w:spacing w:after="0" w:line="240" w:lineRule="auto"/>
@@ -8323,7 +8697,6 @@
   <w:style w:type="table" w:styleId="88">
     <w:name w:val="Medium Grid 1 Accent 5"/>
     <w:basedOn w:val="32"/>
-    <w:qFormat/>
     <w:uiPriority w:val="67"/>
     <w:pPr>
       <w:spacing w:after="0" w:line="240" w:lineRule="auto"/>
@@ -8393,7 +8766,6 @@
   <w:style w:type="table" w:styleId="89">
     <w:name w:val="Medium Grid 1 Accent 6"/>
     <w:basedOn w:val="32"/>
-    <w:qFormat/>
     <w:uiPriority w:val="67"/>
     <w:pPr>
       <w:spacing w:after="0" w:line="240" w:lineRule="auto"/>
@@ -8463,7 +8835,6 @@
   <w:style w:type="table" w:styleId="90">
     <w:name w:val="Medium Grid 2"/>
     <w:basedOn w:val="32"/>
-    <w:qFormat/>
     <w:uiPriority w:val="68"/>
     <w:pPr>
       <w:spacing w:after="0" w:line="240" w:lineRule="auto"/>
@@ -8610,7 +8981,6 @@
   <w:style w:type="table" w:styleId="91">
     <w:name w:val="Medium Grid 2 Accent 1"/>
     <w:basedOn w:val="32"/>
-    <w:qFormat/>
     <w:uiPriority w:val="68"/>
     <w:pPr>
       <w:spacing w:after="0" w:line="240" w:lineRule="auto"/>
@@ -8903,7 +9273,6 @@
   <w:style w:type="table" w:styleId="93">
     <w:name w:val="Medium Grid 2 Accent 3"/>
     <w:basedOn w:val="32"/>
-    <w:qFormat/>
     <w:uiPriority w:val="68"/>
     <w:pPr>
       <w:spacing w:after="0" w:line="240" w:lineRule="auto"/>
@@ -9050,7 +9419,6 @@
   <w:style w:type="table" w:styleId="94">
     <w:name w:val="Medium Grid 2 Accent 4"/>
     <w:basedOn w:val="32"/>
-    <w:qFormat/>
     <w:uiPriority w:val="68"/>
     <w:pPr>
       <w:spacing w:after="0" w:line="240" w:lineRule="auto"/>
@@ -9197,7 +9565,6 @@
   <w:style w:type="table" w:styleId="95">
     <w:name w:val="Medium Grid 2 Accent 5"/>
     <w:basedOn w:val="32"/>
-    <w:qFormat/>
     <w:uiPriority w:val="68"/>
     <w:pPr>
       <w:spacing w:after="0" w:line="240" w:lineRule="auto"/>
@@ -9344,7 +9711,6 @@
   <w:style w:type="table" w:styleId="96">
     <w:name w:val="Medium Grid 2 Accent 6"/>
     <w:basedOn w:val="32"/>
-    <w:qFormat/>
     <w:uiPriority w:val="68"/>
     <w:pPr>
       <w:spacing w:after="0" w:line="240" w:lineRule="auto"/>
@@ -9491,7 +9857,6 @@
   <w:style w:type="table" w:styleId="97">
     <w:name w:val="Medium Grid 3"/>
     <w:basedOn w:val="32"/>
-    <w:qFormat/>
     <w:uiPriority w:val="69"/>
     <w:pPr>
       <w:spacing w:after="0" w:line="240" w:lineRule="auto"/>
@@ -9649,7 +10014,6 @@
   <w:style w:type="table" w:styleId="98">
     <w:name w:val="Medium Grid 3 Accent 1"/>
     <w:basedOn w:val="32"/>
-    <w:qFormat/>
     <w:uiPriority w:val="69"/>
     <w:pPr>
       <w:spacing w:after="0" w:line="240" w:lineRule="auto"/>
@@ -9807,7 +10171,6 @@
   <w:style w:type="table" w:styleId="99">
     <w:name w:val="Medium Grid 3 Accent 2"/>
     <w:basedOn w:val="32"/>
-    <w:qFormat/>
     <w:uiPriority w:val="69"/>
     <w:pPr>
       <w:spacing w:after="0" w:line="240" w:lineRule="auto"/>
@@ -9965,7 +10328,6 @@
   <w:style w:type="table" w:styleId="100">
     <w:name w:val="Medium Grid 3 Accent 3"/>
     <w:basedOn w:val="32"/>
-    <w:qFormat/>
     <w:uiPriority w:val="69"/>
     <w:pPr>
       <w:spacing w:after="0" w:line="240" w:lineRule="auto"/>
@@ -10123,7 +10485,6 @@
   <w:style w:type="table" w:styleId="101">
     <w:name w:val="Medium Grid 3 Accent 4"/>
     <w:basedOn w:val="32"/>
-    <w:qFormat/>
     <w:uiPriority w:val="69"/>
     <w:pPr>
       <w:spacing w:after="0" w:line="240" w:lineRule="auto"/>
@@ -10439,7 +10800,6 @@
   <w:style w:type="table" w:styleId="103">
     <w:name w:val="Medium Grid 3 Accent 6"/>
     <w:basedOn w:val="32"/>
-    <w:qFormat/>
     <w:uiPriority w:val="69"/>
     <w:pPr>
       <w:spacing w:after="0" w:line="240" w:lineRule="auto"/>
@@ -10597,7 +10957,6 @@
   <w:style w:type="table" w:styleId="104">
     <w:name w:val="Dark List"/>
     <w:basedOn w:val="32"/>
-    <w:qFormat/>
     <w:uiPriority w:val="70"/>
     <w:pPr>
       <w:spacing w:after="0" w:line="240" w:lineRule="auto"/>
@@ -10713,7 +11072,6 @@
   <w:style w:type="table" w:styleId="105">
     <w:name w:val="Dark List Accent 1"/>
     <w:basedOn w:val="32"/>
-    <w:qFormat/>
     <w:uiPriority w:val="70"/>
     <w:pPr>
       <w:spacing w:after="0" w:line="240" w:lineRule="auto"/>
@@ -10829,7 +11187,6 @@
   <w:style w:type="table" w:styleId="106">
     <w:name w:val="Dark List Accent 2"/>
     <w:basedOn w:val="32"/>
-    <w:qFormat/>
     <w:uiPriority w:val="70"/>
     <w:pPr>
       <w:spacing w:after="0" w:line="240" w:lineRule="auto"/>
@@ -10945,7 +11302,6 @@
   <w:style w:type="table" w:styleId="107">
     <w:name w:val="Dark List Accent 3"/>
     <w:basedOn w:val="32"/>
-    <w:qFormat/>
     <w:uiPriority w:val="70"/>
     <w:pPr>
       <w:spacing w:after="0" w:line="240" w:lineRule="auto"/>
@@ -11061,7 +11417,6 @@
   <w:style w:type="table" w:styleId="108">
     <w:name w:val="Dark List Accent 4"/>
     <w:basedOn w:val="32"/>
-    <w:qFormat/>
     <w:uiPriority w:val="70"/>
     <w:pPr>
       <w:spacing w:after="0" w:line="240" w:lineRule="auto"/>
@@ -11177,7 +11532,6 @@
   <w:style w:type="table" w:styleId="109">
     <w:name w:val="Dark List Accent 5"/>
     <w:basedOn w:val="32"/>
-    <w:qFormat/>
     <w:uiPriority w:val="70"/>
     <w:pPr>
       <w:spacing w:after="0" w:line="240" w:lineRule="auto"/>
@@ -11293,7 +11647,6 @@
   <w:style w:type="table" w:styleId="110">
     <w:name w:val="Dark List Accent 6"/>
     <w:basedOn w:val="32"/>
-    <w:qFormat/>
     <w:uiPriority w:val="70"/>
     <w:pPr>
       <w:spacing w:after="0" w:line="240" w:lineRule="auto"/>
@@ -11409,7 +11762,6 @@
   <w:style w:type="table" w:styleId="111">
     <w:name w:val="Colorful Shading"/>
     <w:basedOn w:val="32"/>
-    <w:qFormat/>
     <w:uiPriority w:val="71"/>
     <w:pPr>
       <w:spacing w:after="0" w:line="240" w:lineRule="auto"/>
@@ -11558,7 +11910,6 @@
   <w:style w:type="table" w:styleId="112">
     <w:name w:val="Colorful Shading Accent 1"/>
     <w:basedOn w:val="32"/>
-    <w:qFormat/>
     <w:uiPriority w:val="71"/>
     <w:pPr>
       <w:spacing w:after="0" w:line="240" w:lineRule="auto"/>
@@ -11707,7 +12058,6 @@
   <w:style w:type="table" w:styleId="113">
     <w:name w:val="Colorful Shading Accent 2"/>
     <w:basedOn w:val="32"/>
-    <w:qFormat/>
     <w:uiPriority w:val="71"/>
     <w:pPr>
       <w:spacing w:after="0" w:line="240" w:lineRule="auto"/>
@@ -11856,7 +12206,6 @@
   <w:style w:type="table" w:styleId="114">
     <w:name w:val="Colorful Shading Accent 3"/>
     <w:basedOn w:val="32"/>
-    <w:qFormat/>
     <w:uiPriority w:val="71"/>
     <w:pPr>
       <w:spacing w:after="0" w:line="240" w:lineRule="auto"/>
@@ -11985,7 +12334,6 @@
   <w:style w:type="table" w:styleId="115">
     <w:name w:val="Colorful Shading Accent 4"/>
     <w:basedOn w:val="32"/>
-    <w:qFormat/>
     <w:uiPriority w:val="71"/>
     <w:pPr>
       <w:spacing w:after="0" w:line="240" w:lineRule="auto"/>
@@ -12134,7 +12482,6 @@
   <w:style w:type="table" w:styleId="116">
     <w:name w:val="Colorful Shading Accent 5"/>
     <w:basedOn w:val="32"/>
-    <w:qFormat/>
     <w:uiPriority w:val="71"/>
     <w:pPr>
       <w:spacing w:after="0" w:line="240" w:lineRule="auto"/>
@@ -12283,7 +12630,6 @@
   <w:style w:type="table" w:styleId="117">
     <w:name w:val="Colorful Shading Accent 6"/>
     <w:basedOn w:val="32"/>
-    <w:qFormat/>
     <w:uiPriority w:val="71"/>
     <w:pPr>
       <w:spacing w:after="0" w:line="240" w:lineRule="auto"/>
@@ -12432,7 +12778,6 @@
   <w:style w:type="table" w:styleId="118">
     <w:name w:val="Colorful List"/>
     <w:basedOn w:val="32"/>
-    <w:qFormat/>
     <w:uiPriority w:val="72"/>
     <w:pPr>
       <w:spacing w:after="0" w:line="240" w:lineRule="auto"/>
@@ -12525,7 +12870,6 @@
   <w:style w:type="table" w:styleId="119">
     <w:name w:val="Colorful List Accent 1"/>
     <w:basedOn w:val="32"/>
-    <w:qFormat/>
     <w:uiPriority w:val="72"/>
     <w:pPr>
       <w:spacing w:after="0" w:line="240" w:lineRule="auto"/>
@@ -12618,7 +12962,6 @@
   <w:style w:type="table" w:styleId="120">
     <w:name w:val="Colorful List Accent 2"/>
     <w:basedOn w:val="32"/>
-    <w:qFormat/>
     <w:uiPriority w:val="72"/>
     <w:pPr>
       <w:spacing w:after="0" w:line="240" w:lineRule="auto"/>
@@ -12711,7 +13054,6 @@
   <w:style w:type="table" w:styleId="121">
     <w:name w:val="Colorful List Accent 3"/>
     <w:basedOn w:val="32"/>
-    <w:qFormat/>
     <w:uiPriority w:val="72"/>
     <w:pPr>
       <w:spacing w:after="0" w:line="240" w:lineRule="auto"/>
@@ -12804,7 +13146,6 @@
   <w:style w:type="table" w:styleId="122">
     <w:name w:val="Colorful List Accent 4"/>
     <w:basedOn w:val="32"/>
-    <w:qFormat/>
     <w:uiPriority w:val="72"/>
     <w:pPr>
       <w:spacing w:after="0" w:line="240" w:lineRule="auto"/>
@@ -12897,7 +13238,6 @@
   <w:style w:type="table" w:styleId="123">
     <w:name w:val="Colorful List Accent 5"/>
     <w:basedOn w:val="32"/>
-    <w:qFormat/>
     <w:uiPriority w:val="72"/>
     <w:pPr>
       <w:spacing w:after="0" w:line="240" w:lineRule="auto"/>
@@ -12990,7 +13330,6 @@
   <w:style w:type="table" w:styleId="124">
     <w:name w:val="Colorful List Accent 6"/>
     <w:basedOn w:val="32"/>
-    <w:qFormat/>
     <w:uiPriority w:val="72"/>
     <w:pPr>
       <w:spacing w:after="0" w:line="240" w:lineRule="auto"/>
@@ -13083,7 +13422,6 @@
   <w:style w:type="table" w:styleId="125">
     <w:name w:val="Colorful Grid"/>
     <w:basedOn w:val="32"/>
-    <w:qFormat/>
     <w:uiPriority w:val="73"/>
     <w:pPr>
       <w:spacing w:after="0" w:line="240" w:lineRule="auto"/>
@@ -13180,7 +13518,6 @@
   <w:style w:type="table" w:styleId="126">
     <w:name w:val="Colorful Grid Accent 1"/>
     <w:basedOn w:val="32"/>
-    <w:qFormat/>
     <w:uiPriority w:val="73"/>
     <w:pPr>
       <w:spacing w:after="0" w:line="240" w:lineRule="auto"/>
@@ -13277,7 +13614,6 @@
   <w:style w:type="table" w:styleId="127">
     <w:name w:val="Colorful Grid Accent 2"/>
     <w:basedOn w:val="32"/>
-    <w:qFormat/>
     <w:uiPriority w:val="73"/>
     <w:pPr>
       <w:spacing w:after="0" w:line="240" w:lineRule="auto"/>
@@ -13374,7 +13710,6 @@
   <w:style w:type="table" w:styleId="128">
     <w:name w:val="Colorful Grid Accent 3"/>
     <w:basedOn w:val="32"/>
-    <w:qFormat/>
     <w:uiPriority w:val="73"/>
     <w:pPr>
       <w:spacing w:after="0" w:line="240" w:lineRule="auto"/>
@@ -13471,7 +13806,6 @@
   <w:style w:type="table" w:styleId="129">
     <w:name w:val="Colorful Grid Accent 4"/>
     <w:basedOn w:val="32"/>
-    <w:qFormat/>
     <w:uiPriority w:val="73"/>
     <w:pPr>
       <w:spacing w:after="0" w:line="240" w:lineRule="auto"/>
@@ -13568,7 +13902,6 @@
   <w:style w:type="table" w:styleId="130">
     <w:name w:val="Colorful Grid Accent 5"/>
     <w:basedOn w:val="32"/>
-    <w:qFormat/>
     <w:uiPriority w:val="73"/>
     <w:pPr>
       <w:spacing w:after="0" w:line="240" w:lineRule="auto"/>
@@ -13665,7 +13998,6 @@
   <w:style w:type="table" w:styleId="131">
     <w:name w:val="Colorful Grid Accent 6"/>
     <w:basedOn w:val="32"/>
-    <w:qFormat/>
     <w:uiPriority w:val="73"/>
     <w:pPr>
       <w:spacing w:after="0" w:line="240" w:lineRule="auto"/>
@@ -13826,6 +14158,7 @@
     <w:name w:val="Heading 2 Char"/>
     <w:basedOn w:val="132"/>
     <w:link w:val="4"/>
+    <w:qFormat/>
     <w:uiPriority w:val="9"/>
     <w:rPr>
       <w:rFonts w:asciiTheme="majorHAnsi" w:hAnsiTheme="majorHAnsi" w:eastAsiaTheme="majorEastAsia" w:cstheme="majorBidi"/>
@@ -13845,7 +14178,6 @@
     <w:name w:val="Heading 3 Char"/>
     <w:basedOn w:val="132"/>
     <w:link w:val="5"/>
-    <w:qFormat/>
     <w:uiPriority w:val="9"/>
     <w:rPr>
       <w:rFonts w:asciiTheme="majorHAnsi" w:hAnsiTheme="majorHAnsi" w:eastAsiaTheme="majorEastAsia" w:cstheme="majorBidi"/>
@@ -13933,7 +14265,6 @@
     <w:name w:val="Macro Text Char"/>
     <w:basedOn w:val="132"/>
     <w:link w:val="2"/>
-    <w:qFormat/>
     <w:uiPriority w:val="99"/>
     <w:rPr>
       <w:rFonts w:ascii="Courier" w:hAnsi="Courier"/>
@@ -13963,7 +14294,6 @@
     <w:name w:val="Quote Char"/>
     <w:basedOn w:val="132"/>
     <w:link w:val="148"/>
-    <w:qFormat/>
     <w:uiPriority w:val="29"/>
     <w:rPr>
       <w:i/>
@@ -13981,7 +14311,6 @@
     <w:basedOn w:val="132"/>
     <w:link w:val="6"/>
     <w:semiHidden/>
-    <w:qFormat/>
     <w:uiPriority w:val="9"/>
     <w:rPr>
       <w:rFonts w:asciiTheme="majorHAnsi" w:hAnsiTheme="majorHAnsi" w:eastAsiaTheme="majorEastAsia" w:cstheme="majorBidi"/>
@@ -14002,7 +14331,6 @@
     <w:basedOn w:val="132"/>
     <w:link w:val="7"/>
     <w:semiHidden/>
-    <w:qFormat/>
     <w:uiPriority w:val="9"/>
     <w:rPr>
       <w:rFonts w:asciiTheme="majorHAnsi" w:hAnsiTheme="majorHAnsi" w:eastAsiaTheme="majorEastAsia" w:cstheme="majorBidi"/>
@@ -14014,7 +14342,6 @@
     <w:basedOn w:val="132"/>
     <w:link w:val="8"/>
     <w:semiHidden/>
-    <w:qFormat/>
     <w:uiPriority w:val="9"/>
     <w:rPr>
       <w:rFonts w:asciiTheme="majorHAnsi" w:hAnsiTheme="majorHAnsi" w:eastAsiaTheme="majorEastAsia" w:cstheme="majorBidi"/>
@@ -14028,7 +14355,6 @@
     <w:basedOn w:val="132"/>
     <w:link w:val="9"/>
     <w:semiHidden/>
-    <w:qFormat/>
     <w:uiPriority w:val="9"/>
     <w:rPr>
       <w:rFonts w:asciiTheme="majorHAnsi" w:hAnsiTheme="majorHAnsi" w:eastAsiaTheme="majorEastAsia" w:cstheme="majorBidi"/>
@@ -14050,7 +14376,6 @@
     <w:basedOn w:val="132"/>
     <w:link w:val="10"/>
     <w:semiHidden/>
-    <w:qFormat/>
     <w:uiPriority w:val="9"/>
     <w:rPr>
       <w:rFonts w:asciiTheme="majorHAnsi" w:hAnsiTheme="majorHAnsi" w:eastAsiaTheme="majorEastAsia" w:cstheme="majorBidi"/>
@@ -14069,7 +14394,6 @@
     <w:basedOn w:val="132"/>
     <w:link w:val="11"/>
     <w:semiHidden/>
-    <w:qFormat/>
     <w:uiPriority w:val="9"/>
     <w:rPr>
       <w:rFonts w:asciiTheme="majorHAnsi" w:hAnsiTheme="majorHAnsi" w:eastAsiaTheme="majorEastAsia" w:cstheme="majorBidi"/>
@@ -14119,7 +14443,6 @@
     <w:name w:val="Intense Quote Char"/>
     <w:basedOn w:val="132"/>
     <w:link w:val="156"/>
-    <w:qFormat/>
     <w:uiPriority w:val="30"/>
     <w:rPr>
       <w:b/>

</xml_diff>